<commit_message>
Fix reproducibility: add figure generation scripts, dependencies, missing data file, and update README
</commit_message>
<xml_diff>
--- a/SciRep_Manuscript_TextOnly.docx
+++ b/SciRep_Manuscript_TextOnly.docx
@@ -8,7 +8,7 @@
         <w:spacing w:before="360" w:line="240" w:lineRule="auto"/>
       </w:pPr>
       <w:r>
-        <w:t>Apparent emergent constraints on hyperarid extreme rainfall arise from predictand construction, sampling variability and post-processing</w:t>
+        <w:t>Reliability of emergent constraints for regional extreme-rainfall projections in hyperarid climates</w:t>
       </w:r>
     </w:p>
     <w:p>
@@ -174,7 +174,7 @@
         <w:jc w:val="both"/>
       </w:pPr>
       <w:r>
-        <w:t>Emergent constraints use present-climate observations to narrow projection spread, but their behaviour for a single arid country and statistically downscaled impact-assessment ensembles is untested. We evaluated eleven pre-specified observable predictors of projected change in wet-season extreme rainfall over the United Arab Emirates, spanning atmospheric process fidelity, present-day extreme-rainfall state, and present-day variability and historical change. Across 23 NEX-GDDP-CMIP6 models from 13 genealogical families, two domains and four emission scenarios, we ran 176 tests with one false-discovery correction and leave-one-family-out cross-validation. Eleven tests met every criterion, but all used predictors mathematically embedded in the projected-change metric (the predictand), all relationships were negative, and nine occurred under the weakest-forcing scenario, consistent with shared sampling error. No predictor independent of the predictand met the criteria, and 29 of 44 relationships reversed sign between scenarios. Three measurable properties explain this: finite-period sampling supplies a quarter to a half of inter-model spread; percentile indices calibrated on the same historical period can generate artificial anticorrelation between subperiods, confounding conventional split-sample tests; and bias-corrected downscaling removes 85–89% of between-model variance in present-day extremes. Robust constraint analysis requires predictors external to the predictand, out-of-sample index calibration and testing across forcing pathways.</w:t>
+        <w:t>Emergent constraints use present-climate observations to reduce uncertainty in future projections, yet their effectiveness for small hyperarid regions and statistically downscaled climate projections remains unclear. We evaluated eleven pre-specified observable predictors of future changes in wet-season extreme rainfall over the United Arab Emirates. Across 23 NEX-GDDP-CMIP6 models from 13 genealogical families, two spatial domains within the UAE, and four emission scenarios, we tested 176 predictor–projection relationships using false-discovery control and leave-one-family-out cross-validation. Eleven tests met all criteria, but every successful test used a predictor mathematically embedded in the projected-change quantity, all relationships were negative, and nine occurred under the lowest-emission scenario (SSP1-2.6), consistent with shared sampling error. No predictor independent of the predictand met the criteria, and 29 of 44 relationships changed sign across scenarios. Finite-period sampling accounted for about one-quarter to one-half of inter-model spread, percentile indices calibrated on the same historical period generated artificial anticorrelation between subperiods, and bias-corrected downscaling removed 85–89% of between-model variance in present-day extremes. Robust emergent-constraint analysis therefore requires independent predictors, out-of-sample percentile calibration, and testing across multiple emission scenarios on a fixed model set.</w:t>
       </w:r>
     </w:p>
     <w:p>
@@ -190,74 +190,35 @@
         <w:pStyle w:val="BodyText"/>
       </w:pPr>
       <w:r>
-        <w:t>Extreme rainfall in hyperarid climates is concentrated in a few storms, so a single event can dominate annual totals, groundwater recharge and flood impacts. The United Arab Emirates (UAE) exem</w:t>
-      </w:r>
-      <w:r>
-        <w:t xml:space="preserve">plifies this regime: mean annual rainfall at its longest gauge record is </w:t>
+        <w:t xml:space="preserve">Extreme rainfall in hyperarid climates is concentrated in a few storms, so a single event can dominate annual totals, groundwater recharge and flood impacts. The United Arab Emirates (UAE) exemplifies this regime: mean annual rainfall at its longest gauge record is about 81 mm, yet the 15–16 April 2024 cut-off-low storm delivered about 144 mm at Dubai International Airport and a national daily maximum near 259.5 mm [1]. CMIP6 simulations </w:t>
       </w:r>
       <w:r>
         <w:lastRenderedPageBreak/>
-        <w:t>about 81 mm, yet the 15–16 April 2024 cut-off-low storm delivered about 144 mm at Dubai International Airport and a national daily maximum near 259.5 mm [1]. CMIP6 simulations project</w:t>
-      </w:r>
-      <w:r>
-        <w:t xml:space="preserve"> stronger precipitation extremes over the Arabian Peninsula [2], and downscaled multi-model projections for the UAE report intensification across emission pathways [3], but with a spread wide enough that the sign of change differs between models. Whether a</w:t>
-      </w:r>
-      <w:r>
-        <w:t>ny observable property of present-day models can narrow that spread is therefore a practical question for adaptation planning.</w:t>
-      </w:r>
-    </w:p>
-    <w:p>
-      <w:pPr>
-        <w:pStyle w:val="BodyText"/>
-      </w:pPr>
-      <w:r>
-        <w:t>Emergent constraints address this question by relating an observable present-day predictor to a projected quantity (the predictan</w:t>
-      </w:r>
-      <w:r>
-        <w:t>d) across a model ensemble and evaluating the relationship at the observed value [4,5]. For precipitation extremes, they have succeeded at large scales. Present-day precipitation variability reduced projection spread by 20–40% in extratropical applications</w:t>
-      </w:r>
-      <w:r>
-        <w:t xml:space="preserve"> [6], and observed changes in the frequency of extremes constrain projected changes globally [7]. Other approaches combine temperature- and precipitation-based predictors hierarchically [8], aggregate spatial information to reduce local error variance [9],</w:t>
-      </w:r>
-      <w:r>
-        <w:t xml:space="preserve"> or use observed Hadley-circulation trends to constrain subtropical precipitation [10]. However, constraints may not reproduce between model generations [11–13], can be confidently wrong when the predictor–predictand relationship is misspecified [14], and </w:t>
-      </w:r>
-      <w:r>
-        <w:t>require out-of-sample validation to be credible [15]. Historical model performance improves regional projections only when the performance metric is tied to the future response [16].</w:t>
-      </w:r>
-    </w:p>
-    <w:p>
-      <w:pPr>
-        <w:pStyle w:val="BodyText"/>
-      </w:pPr>
-      <w:r>
-        <w:t>Three conditions relevant to hyperarid regions have not been examined tog</w:t>
-      </w:r>
-      <w:r>
-        <w:t>ether. The first is spatial scale: published constraints rest on global or continental aggregates, where averaging suppresses the internal variability that dominates a single arid country. The second is the processing chain: constraint studies use raw mode</w:t>
-      </w:r>
-      <w:r>
-        <w:t xml:space="preserve">l output, whereas impact assessment uses statistically downscaled products in which bias adjustment has already reshaped the inter-model distribution of present-day extremes [17,18]. The third is predictand construction: where projected change is measured </w:t>
-      </w:r>
-      <w:r>
-        <w:t xml:space="preserve">relative to a present-day baseline, the historical value enters both predictor and predictand, and shared sampling error can generate a correlation with no physical content. That effect grows as the forced signal falls relative to interannual variability, </w:t>
-      </w:r>
-      <w:r>
-        <w:t>which is the hyperarid condition.</w:t>
-      </w:r>
-    </w:p>
-    <w:p>
-      <w:pPr>
-        <w:pStyle w:val="BodyText"/>
-      </w:pPr>
-      <w:r>
-        <w:t>Here we ask why plausible observable predictors fail to constrain projected extreme rainfall at the scale of a hyperarid country, and what the answer implies for constraint analysis elsewhere. We first establish the observ</w:t>
-      </w:r>
-      <w:r>
-        <w:t>ed rainfall gradient and its moisture-transport context and score CMIP6 models on a precipitation-independent measure of circulation and moisture-transport fidelity. We then test eleven pre-specified predictors against projected change in two extreme-rainf</w:t>
-      </w:r>
-      <w:r>
-        <w:t>all indices under four emission scenarios, and identify the measurable properties of the data that determine the outcome.</w:t>
+        <w:t>project stronger precipitation extremes over the Arabian Peninsula [2], and downscaled multi-model projections for the UAE report intensification across emission pathways [3], but with a spread wide enough that the sign of change differs between models. Whether any observable property of present-day models can narrow that spread is therefore a practical question for adaptation planning.</w:t>
+      </w:r>
+    </w:p>
+    <w:p>
+      <w:pPr>
+        <w:pStyle w:val="BodyText"/>
+      </w:pPr>
+      <w:r>
+        <w:t>Emergent constraints address this question by relating an observable present-day predictor to a projected quantity (the predictand) across a model ensemble and evaluating the relationship at the observed value [4,5]. For precipitation extremes, they have succeeded at large scales. Present-day precipitation variability reduced projection spread by 20–40% in extratropical applications [6], and observed changes in the frequency of extremes constrain projected changes globally [7]. Other approaches combine temperature- and precipitation-based predictors hierarchically [8], aggregate spatial information to reduce local error variance [9], or use observed Hadley-circulation trends to constrain subtropical precipitation [10]. However, constraints may not reproduce between model generations [11–13], can be confidently wrong when the predictor–predictand relationship is misspecified [14], and require out-of-sample validation to be credible [15]. Historical model performance improves regional projections only when the performance metric is tied to the future response [16].</w:t>
+      </w:r>
+    </w:p>
+    <w:p>
+      <w:pPr>
+        <w:pStyle w:val="BodyText"/>
+      </w:pPr>
+      <w:r>
+        <w:t>Three conditions relevant to hyperarid regions have not been examined together. The first is spatial scale: published constraints rest on global or continental aggregates, where averaging suppresses the internal variability that dominates a small arid region. The second is the processing chain: constraint studies use raw model output, whereas impact assessment uses statistically downscaled products in which bias adjustment has already reshaped the inter-model distribution of present-day extremes [17,18]. The third is predictand construction: where projected change is measured relative to a present-day baseline, the historical value enters both predictor and predictand, and shared sampling error can generate a correlation with no physical content. That effect grows as the forced signal falls relative to interannual variability, which is the hyperarid condition.</w:t>
+      </w:r>
+    </w:p>
+    <w:p>
+      <w:pPr>
+        <w:pStyle w:val="BodyText"/>
+      </w:pPr>
+      <w:r>
+        <w:t>Here we ask why plausible observable predictors fail to constrain projected extreme rainfall at the scale of a small hyperarid region, and what the answer implies for constraint analysis elsewhere. We first establish the observed rainfall gradient and its moisture-transport context and score CMIP6 models on a precipitation-independent measure of circulation and moisture-transport fidelity. We then test eleven pre-specified predictors against projected change in two extreme-rainfall indices under four emission scenarios, and identify the measurable properties of the data that determine the outcome.</w:t>
       </w:r>
     </w:p>
     <w:p>
@@ -274,44 +235,31 @@
         <w:pStyle w:val="Heading2"/>
       </w:pPr>
       <w:r>
-        <w:t>Observed rainfall gradient and its moisture pathway</w:t>
-      </w:r>
-    </w:p>
-    <w:p>
-      <w:pPr>
-        <w:pStyle w:val="BodyText"/>
-      </w:pPr>
-      <w:r>
-        <w:t>Three independent gauge sources resolve a west–east gradient in UAE rainfa</w:t>
-      </w:r>
-      <w:r>
-        <w:t>ll (Fig. 1). National Center of Meteorology (NCM) annual means rise from 33.1 mm yr⁻¹ at Zayed International Airport to 113.1 mm yr⁻¹ at Masafi, and Global Summary of the Day (GSOD) airport records give east/west ratios of 1.67 for annual rainfall and 2.06</w:t>
-      </w:r>
-      <w:r>
-        <w:t xml:space="preserve"> for mean annual Rx1day. Across the 15-station NCM network, annual means correlate with longitude (r = 0.64) and elevation (r = 0.53), and every Hajar Mountains station is wetter than every western-desert station. Station-corrected CHIRPS preserves the eas</w:t>
-      </w:r>
-      <w:r>
-        <w:t>tward increase across six indices (Supplementary Fig. S1; Supplementary Table S1), but gauge-derived correction factors do not transfer between stations: leave-one-station-out error was 63% for the corrected field against 50% for raw CHIRPS, and factors ra</w:t>
-      </w:r>
-      <w:r>
-        <w:t>nged from 0.27 to 1.96 (Supplementary Fig. S2; Supplementary Tables S2 and S3). The corrected field is therefore used only for climatological spatial completion, and the gradient rests on the gauges.</w:t>
-      </w:r>
-    </w:p>
-    <w:p>
-      <w:pPr>
-        <w:pStyle w:val="BodyText"/>
-      </w:pPr>
-      <w:r>
-        <w:t>The ERA5 composite of the 62 wettest of 186 wet-season m</w:t>
-      </w:r>
-      <w:r>
-        <w:t xml:space="preserve">onths defines a UAE Rainfall Circulation Signature (URCS): a 500-hPa trough north-west of the country with anomalous integrated vapour transport (IVT) from the Arabian Sea and Gulf of Oman toward the eastern and northern emirates, where it meets the Hajar </w:t>
-      </w:r>
-      <w:r>
-        <w:t>Mountains (Fig. 2). Independent total-column water-vapour diagnostics reproduce the same pathway (Supplementary Fig. S3). No wet-season index shows a 1982–2024 trend that survives false-discovery control (minimum q = 0.72), and nominal results depend on th</w:t>
-      </w:r>
-      <w:r>
-        <w:t>e 2024 endpoint (Supplementary Fig. S4; Supplementary Table S4).</w:t>
+        <w:t>Observed rainfall gradient, moisture pathway and model fidelity</w:t>
+      </w:r>
+    </w:p>
+    <w:p>
+      <w:pPr>
+        <w:pStyle w:val="NormalWeb"/>
+      </w:pPr>
+      <w:r>
+        <w:t>Three independent gauge sources show a consistent west–east rainfall gradient across the UAE (Fig. 1). NCM annual means increase from 33.1 mm yr⁻¹ at Zayed International Airport to 113.1 mm yr⁻¹ at Masafi, while GSOD airport records give east-to-west ratios of 1.67 for annual rainfall and 2.06 for mean annual Rx1day. Across the 15-station NCM network, annual rainfall correlates with longitude (r = 0.64) and elevation (r = 0.53), and every Hajar Mountains station is wetter than every western-desert station. Station-corrected CHIRPS reproduces the eastward increase across six indices (Supplementary Fig. S1; Supplementary Table S1), but correction factors do not transfer reliably between stations: leave-one-station-out error was 63% for corrected CHIRPS versus 50% for raw CHIRPS, with factors ranging from 0.27 to 1.96 (Supplementary Fig. S2; Supplementary Tables S2 and S3). The corrected field is therefore used only for climatological spatial completion, with the gradient itself established from gauge observations.</w:t>
+      </w:r>
+    </w:p>
+    <w:p>
+      <w:pPr>
+        <w:pStyle w:val="NormalWeb"/>
+      </w:pPr>
+      <w:r>
+        <w:t>The ERA5 composite of the 62 wettest of 186 wet-season months defines the UAE Rainfall Circulation Signature (URCS): a 500-hPa trough north-west of the UAE accompanied by anomalous integrated vapour transport (IVT) from the Arabian Sea and Gulf of Oman toward the eastern and northern emirates and the Hajar Mountains (Fig. 2). Independent total-column water-vapour diagnostics reproduce the same pathway (Supplementary Fig. S3). No wet-season rainfall index shows a significant 1982–2024 trend after false-discovery control (minimum q = 0.72), and nominal results are sensitive to inclusion of 2024 (Supplementary Fig. S4; Supplementary Table S4).</w:t>
+      </w:r>
+    </w:p>
+    <w:p>
+      <w:pPr>
+        <w:pStyle w:val="NormalWeb"/>
+      </w:pPr>
+      <w:r>
+        <w:t>Evaluated against the URCS without using simulated precipitation, 21 CMIP6 models have PFS values ranging from 0.51 to 0.99 (median 0.88), with most variation arising from IVT amplitude rather than spatial pattern (Fig. 3; Supplementary Table S5). CESM2-family models and MIROC6 rank highest and CanESM5 lowest. Rankings remain robust across four weighting schemes and 10,000 random weight perturbations, with rank correlations of 0.88–1.00. MERRA-2 and JRA-55 score 0.98 and 0.92, respectively, showing that the reference pattern is not specific to ERA5 (Supplementary Table S6).</w:t>
       </w:r>
     </w:p>
     <w:p>
@@ -319,21 +267,34 @@
         <w:pStyle w:val="Heading2"/>
       </w:pPr>
       <w:r>
-        <w:t>Process fidelity of CMIP6 models</w:t>
-      </w:r>
-    </w:p>
-    <w:p>
-      <w:pPr>
-        <w:pStyle w:val="BodyText"/>
-      </w:pPr>
-      <w:r>
-        <w:t>Scored against the URCS without using simulated precipitation, 21 CMIP6 models span a Process Fidelity Score (PFS) of 0.51–0.99 (median 0.88), with most of th</w:t>
-      </w:r>
-      <w:r>
-        <w:t>e spread arising from IVT amplitude rather than spatial pattern (Fig. 3; Supplementary Table S5). CESM2-family models and MIROC6 rank highest and CanESM5 lowest, and the ranking is robust to weighting: across four schemes and 10,000 random perturbations of</w:t>
-      </w:r>
-      <w:r>
-        <w:t xml:space="preserve"> the weights, rank correlations remain 0.88–1.00. MERRA-2 and JRA-55 score 0.98 and 0.92, so the reference pattern is not specific to one reanalysis (Supplementary Table S6).</w:t>
+        <w:t>Projected change across four emission scenarios</w:t>
+      </w:r>
+    </w:p>
+    <w:p>
+      <w:pPr>
+        <w:spacing w:before="100" w:beforeAutospacing="1" w:after="100" w:afterAutospacing="1" w:line="240" w:lineRule="auto"/>
+        <w:rPr>
+          <w:rFonts w:ascii="Times New Roman" w:eastAsia="Times New Roman" w:hAnsi="Times New Roman" w:cs="Times New Roman"/>
+          <w:lang w:val="en-US" w:eastAsia="en-US"/>
+        </w:rPr>
+      </w:pPr>
+      <w:r>
+        <w:rPr>
+          <w:rFonts w:ascii="Times New Roman" w:eastAsia="Times New Roman" w:hAnsi="Times New Roman" w:cs="Times New Roman"/>
+          <w:lang w:val="en-US" w:eastAsia="en-US"/>
+        </w:rPr>
+        <w:t xml:space="preserve">Across the same 23 models under all four scenarios, projected wet-season extremes for 2076–2100 relative to 1990–2014 show large inter-model spread and no monotonic ordering across scenarios (Table 1). National Rx1day increases by 21.4%, 13.7%, 30.0% and 14.5% under SSP1-2.6, SSP2-4.5, SSP3-7.0 and SSP5-8.5, respectively, with standard deviations of 26–76 percentage points; 13–15 of 23 models project increases in each scenario. National R95p increases by 57.7–174.5%, with standard deviations of 83–464 percentage points. Historical baselines are 13.44 mm for Rx1day and 12.54 mm for R95p. Because the model set is identical </w:t>
+      </w:r>
+      <w:r>
+        <w:rPr>
+          <w:rFonts w:ascii="Times New Roman" w:eastAsia="Times New Roman" w:hAnsi="Times New Roman" w:cs="Times New Roman"/>
+          <w:lang w:val="en-US" w:eastAsia="en-US"/>
+        </w:rPr>
+        <w:lastRenderedPageBreak/>
+        <w:t>across scenarios, differences in ensemble composition cannot explain the non-monotonic pattern. The projected response is small relative to inter-model spread, preventing clear separation among scenarios at this scale. Finite-period resampling shows that sampling alone accounts for approximately one-quarter to one-half of the inter-model spread in absolute change (Supplementary Table S7; Supplementary Figs. S5 and S6)</w:t>
+      </w:r>
+      <w:r>
+        <w:t>.</w:t>
       </w:r>
     </w:p>
     <w:p>
@@ -341,30 +302,39 @@
         <w:pStyle w:val="Heading2"/>
       </w:pPr>
       <w:r>
-        <w:t>Projected change across four emission scenarios</w:t>
-      </w:r>
-    </w:p>
-    <w:p>
-      <w:pPr>
-        <w:pStyle w:val="BodyText"/>
-      </w:pPr>
-      <w:r>
-        <w:t xml:space="preserve">On the 23 models available under </w:t>
-      </w:r>
-      <w:r>
-        <w:t>all four scenarios, projected change in wet-season extremes for 2076–2100 relative to 1990–2014 is large in the ensemble mean, widely spread and not ordered by forcing (Table 1). National Rx1day increases by 21.4% under SSP1-2.6, 13.7% under SSP2-4.5, 30.0</w:t>
-      </w:r>
-      <w:r>
-        <w:t xml:space="preserve">% under SSP3-7.0 and 14.5% under SSP5-8.5, with inter-model standard deviations of 26–76 percentage points. Between 13 and 15 of the 23 models project an increase in each scenario. National R95p increases by 57.7–174.5%, with standard deviations of 83–464 </w:t>
-      </w:r>
-      <w:r>
-        <w:t>percentage points. Baselines are 13.44 mm for national Rx1day and 12.54 mm for national R95p. Because the model set is identical across scenarios, the non-monotonic ordering cannot arise from ensemble composition: the forced response is smaller than the sp</w:t>
-      </w:r>
-      <w:r>
-        <w:t>read in which it is embedded, and this ensemble does not resolve the ordering of scenarios at this scale. Resampling the 25 seasons of each period shows that finite-period sampling alone accounts for a quarter to a half of inter-model spread in absolute ch</w:t>
-      </w:r>
-      <w:r>
-        <w:t>ange (Supplementary Table S7; Supplementary Figs. S5 and S6).</w:t>
+        <w:t>Constraint tests across eleven predictors and four scenarios</w:t>
+      </w:r>
+    </w:p>
+    <w:p>
+      <w:pPr>
+        <w:pStyle w:val="NormalWeb"/>
+      </w:pPr>
+      <w:r>
+        <w:t>Of 176 pre-specified tests of absolute change, 11 met all criteria (Table 2; Fig. 4). All used present-day index levels that also enter the predictand; none of the 112 tests using independent predictors met the criteria. All 11 relationships were negative, with a mean absolute correlation of 0.760, and nine occurred under SSP1-2.6, the scenario with the smallest projected change; the remaining two occurred under SSP3-7.0. Full results are provided in Supplementary Data 1.</w:t>
+      </w:r>
+    </w:p>
+    <w:p>
+      <w:pPr>
+        <w:pStyle w:val="NormalWeb"/>
+      </w:pPr>
+      <w:r>
+        <w:t>The pattern is consistent with shared-error coupling. When projected change is defined as the future mean minus the historical mean and the historical mean is also used as the predictor, their covariance contains a negative term equal to the variance of the historical level. If across-model covariance between historical and future levels is small, as here, this term can dominate, producing an apparent negative relationship that strengthens as forced change becomes small relative to historical variability. Because the same coupling occurs in every model, it can survive cross-validation, bootstrap resampling and family jackknifing without representing physical predictive skill.</w:t>
+      </w:r>
+    </w:p>
+    <w:p>
+      <w:pPr>
+        <w:pStyle w:val="NormalWeb"/>
+      </w:pPr>
+      <w:r>
+        <w:t>The same pattern appeared when change was expressed relative to the historical baseline: nine tests met all criteria, all involved level predictors, all were negative, and their mean absolute correlation was 0.842. Absolute change therefore did not remove the coupling, although correlations weakened and more tests met the criteria. The strongest independent relationship, between interannual Rx1day variability and eastern-domain R95p change under SSP1-2.6 (r = −0.711), had a false-discovery-adjusted probability of 0.108 and leave-one-family-out skill of −0.216. Process fidelity showed no robust relationship with projected change for any index, domain or scenario (Fig. 4; Supplementary Fig. S7; Supplementary Table S8). The historical warming trend likewise showed no out-of-sample skill under SSP5-8.5, with leave-one-family-out skill from −0.066 to +0.053 and a minimum q value of 0.144.</w:t>
+      </w:r>
+    </w:p>
+    <w:p>
+      <w:pPr>
+        <w:pStyle w:val="NormalWeb"/>
+      </w:pPr>
+      <w:r>
+        <w:t>The relationships were also unstable across emission scenarios. On the same 23-model set, correlations between historical and future national R95p were −0.63, +0.16, −0.52 and +0.08 under SSP1-2.6, SSP2-4.5, SSP3-7.0 and SSP5-8.5; corresponding eastern-domain values were −0.73, +0.23, −0.49 and +0.19 (Fig. 5b). Leave-one-family-out skill was negative in 22 of 24 level-to-level cases. Across the full set of tests, 29 of 44 predictor–index–domain combinations changed sign between scenarios, compared with 22 of 44 for fractional change. Although a physically meaningful relationship may vary in strength among scenarios, reversal of direction across an identical model set is not sufficiently stable for predictive interpretation.</w:t>
       </w:r>
     </w:p>
     <w:p>
@@ -372,75 +342,8 @@
         <w:pStyle w:val="Heading2"/>
       </w:pPr>
       <w:r>
-        <w:t>Constraint tests across eleven predictors and four scenarios</w:t>
-      </w:r>
-    </w:p>
-    <w:p>
-      <w:pPr>
-        <w:pStyle w:val="BodyText"/>
-      </w:pPr>
-      <w:r>
-        <w:t xml:space="preserve">Of 176 pre-specified tests on absolute change, 11 met every criterion (Table 2; Fig. 4), and their pattern identifies them. All 11 </w:t>
-      </w:r>
-      <w:r>
-        <w:t>used a predictor drawn from the present-day level of an index, a quantity that also enters the predictand; none of the 112 tests using a predictor independent of the predictand construction met the criteria. All 11 correlations were negative, with mean mag</w:t>
-      </w:r>
-      <w:r>
-        <w:t>nitude 0.760, and nine fell in SSP1-2.6, the scenario with the smallest forced change; the other two fell in SSP3-7.0. Results for every test are given in Supplementary Data 1.</w:t>
-      </w:r>
-    </w:p>
-    <w:p>
-      <w:pPr>
-        <w:pStyle w:val="BodyText"/>
-      </w:pPr>
-      <w:r>
-        <w:t>Each of these features is predicted by shared-error coupling. When the predicta</w:t>
-      </w:r>
-      <w:r>
-        <w:t>nd is the difference between future and historical means and the predictor is the historical mean, their covariance contains a term equal to minus the variance of the historical level. Where the across-model covariance of historical and future levels is sm</w:t>
-      </w:r>
-      <w:r>
-        <w:t>all, as here, that term dominates and the correlation is negative by construction, and its magnitude grows as the forced change shrinks relative to the historical level. Because the coupling is present in every model, it transfers between training and vali</w:t>
-      </w:r>
-      <w:r>
-        <w:t>dation subsets and is invisible to cross-validation, bootstrap resampling and family jackknifing.</w:t>
-      </w:r>
-    </w:p>
-    <w:p>
-      <w:pPr>
-        <w:pStyle w:val="BodyText"/>
-      </w:pPr>
-      <w:r>
-        <w:t>Repeating the grid with change expressed as a fraction of the baseline gives the same picture: nine tests met the criteria, all from level predictors, all neg</w:t>
-      </w:r>
-      <w:r>
-        <w:t>ative, with mean magnitude 0.842. Expressing change in absolute units therefore does not remove the coupling; it weakens each correlation while admitting more tests. The strongest relationship from a predictor independent of the predictand, between interan</w:t>
-      </w:r>
-      <w:r>
-        <w:t>nual Rx1day variability and eastern R95p change under SSP1-2.6 (r = −0.711), had an adjusted probability of 0.108 and leave-one-family-out skill of −0.216. Process fidelity is unrelated to projected change in any index, domain or scenario (Fig. 4; Suppleme</w:t>
-      </w:r>
-      <w:r>
-        <w:t>ntary Fig. S7; Supplementary Table S8), and the observed historical warming trend, the predictor class on which the leading published constraints rest, likewise gives no out-of-sample skill under SSP5-8.5 (leave-one-family-out skill −0.066 to +0.053; minim</w:t>
-      </w:r>
-      <w:r>
-        <w:t>um q = 0.144).</w:t>
-      </w:r>
-    </w:p>
-    <w:p>
-      <w:pPr>
-        <w:pStyle w:val="BodyText"/>
-      </w:pPr>
-      <w:r>
-        <w:t>Relationships are not stable across forcing pathways. On the fixed 23-model set, the correlation between historical and future national R95p is −0.63 under SSP1-2.6, +0.16 under SSP2-4.5, −0.52 under SSP3-7.0 and +0.08 under SSP5-8.5. The co</w:t>
-      </w:r>
-      <w:r>
-        <w:t>rresponding eastern values are −0.73, +0.23, −0.49 and +0.19 (Fig. 5b), and leave-one-family-out skill for these level-to-level relationships is negative in 22 of 24 cases. Across the battery, 29 of 44 predictor–index–domain combinations change sign betwee</w:t>
-      </w:r>
-      <w:r>
-        <w:t>n scenarios (22 of 44 for fractional change). A physically grounded constraint may change slope between pathways as the response scales, but a relationship that reverses direction between pathways on identical models is not stable enough to support a predi</w:t>
-      </w:r>
-      <w:r>
-        <w:t>ctive interpretation.</w:t>
+        <w:lastRenderedPageBreak/>
+        <w:t>Index construction and the split-sample remedy</w:t>
       </w:r>
     </w:p>
     <w:p>
@@ -453,39 +356,18 @@
     </w:p>
     <w:p>
       <w:pPr>
-        <w:pStyle w:val="BodyText"/>
-      </w:pPr>
-      <w:r>
-        <w:t xml:space="preserve">A standard remedy for shared-error coupling is a split-sample test, in which predictor and baseline are computed from disjoint subperiods. For percentile-threshold indices this remedy is </w:t>
-      </w:r>
-      <w:r>
-        <w:t>itself confounded. Two disjoint halves of a model's historical record should be independent estimates of the same quantity and should correlate positively across models. For Rx1day they do, at +0.41 nationally and +0.34 in the east (Fig. 5a). For R95p comp</w:t>
-      </w:r>
-      <w:r>
-        <w:t>uted with a threshold estimated over the whole historical period they correlate negatively, at −0.37 and −0.46, and the half-record standard deviation is 1.7 times the full-record value, which is not possible for independent halves. Because the 95th percen</w:t>
-      </w:r>
-      <w:r>
-        <w:t>tile is estimated from the same 25 seasons over which R95p is accumulated, total exceedance over the record is nearly fixed and seasons compete for it. Estimating the threshold from the odd-numbered seasons alone reduces the correlation between halves to −</w:t>
-      </w:r>
-      <w:r>
-        <w:t>0.18 and −0.11 and brings the half-record standard deviation to within 11% of the full-record value.</w:t>
-      </w:r>
-    </w:p>
-    <w:p>
-      <w:pPr>
-        <w:pStyle w:val="BodyText"/>
-      </w:pPr>
-      <w:r>
-        <w:t>The consequence is visible in the SSP5-8.5 ensemble. A split-sample estimate relating odd-season R95p to projected absolute change against an even-season b</w:t>
-      </w:r>
-      <w:r>
-        <w:t>aseline gives an apparent positive relationship (r = +0.43 nationally, +0.50 in the east; Supplementary Fig. S8; Supplementary Table S9). The result depends on which seasons are assigned to each half. Across 500 random disjoint splits, the national correla</w:t>
-      </w:r>
-      <w:r>
-        <w:t xml:space="preserve">tion has a median of +0.14 (95% range −0.24 to +0.44) and the eastern correlation a median of +0.21 (−0.13 to +0.48). These values match the medians of permutation nulls that retain the coupling but remove any historical–future link (+0.14 and +0.21). The </w:t>
-      </w:r>
-      <w:r>
-        <w:t>odd–even estimates are therefore upper-tail outcomes of an arbitrary split rather than evidence of a relationship, consistent with the absence of any correlation between historical and future R95p levels in the same ensemble (r = +0.02 and +0.08).</w:t>
+        <w:pStyle w:val="NormalWeb"/>
+      </w:pPr>
+      <w:r>
+        <w:t>A split-sample test is commonly used to reduce shared-error coupling by calculating the predictor and baseline from disjoint subperiods. For percentile-threshold indices, however, the split can remain confounded. Independent halves of the historical record should correlate positively across models. Rx1day does so (+0.41 nationally; +0.34 in the east; Fig. 5a), whereas R95p calculated with a threshold estimated from the full historical period correlates negatively between halves (−0.37 and −0.46). Its half-record standard deviation is also 1.7 times the full-record value. Because the 95th-percentile threshold is estimated from the same 25 seasons used to accumulate R95p, total exceedance over the calibration period is nearly fixed, forcing subperiods to trade off against one another. Estimating the threshold from odd-numbered seasons alone weakens the negative correlations to −0.18 and −0.11 and reduces the half-record standard deviation to within 11% of the full-record value.</w:t>
+      </w:r>
+    </w:p>
+    <w:p>
+      <w:pPr>
+        <w:pStyle w:val="NormalWeb"/>
+      </w:pPr>
+      <w:r>
+        <w:t>Under SSP5-8.5, using odd-season R95p as the predictor and an even-season baseline for projected absolute change yields apparent positive correlations of +0.43 nationally and +0.50 in the eastern domain (Supplementary Fig. S8; Supplementary Table S9). Yet these estimates depend on the seasonal split. Across 500 random disjoint partitions, median correlations are +0.14 nationally (95% range −0.24 to +0.44) and +0.21 in the east (−0.13 to +0.48), matching permutation-null medians that preserve the coupling but remove historical–future association (+0.14 and +0.21). The odd–even estimates are therefore upper-tail outcomes of an arbitrary split rather than evidence of a robust relationship, consistent with historical–future R95p correlations of only +0.02 and +0.08 in the same ensemble.</w:t>
       </w:r>
     </w:p>
     <w:p>
@@ -493,251 +375,148 @@
         <w:pStyle w:val="Heading2"/>
       </w:pPr>
       <w:r>
-        <w:t xml:space="preserve">Loss </w:t>
-      </w:r>
-      <w:r>
-        <w:t>of between-model information in bias-corrected downscaling</w:t>
-      </w:r>
-    </w:p>
-    <w:p>
-      <w:pPr>
-        <w:pStyle w:val="BodyText"/>
-      </w:pPr>
-      <w:r>
-        <w:t>For the 27 models available both as raw CMIP6 output and as NEX-GDDP-CMIP6, the coefficient of variation of present-day wet-season Rx1day across models falls from 0.463 to 0.178 after bias-correcte</w:t>
-      </w:r>
-      <w:r>
-        <w:t>d downscaling, retaining 14.8% of the normalised variance. For R95p, it falls from 0.576 to 0.194, retaining 11.4% (Fig. 6; Supplementary Table S10). The correspondence between a model's raw and downscaled present-day level is weak for Rx1day (r = +0.26) a</w:t>
-      </w:r>
-      <w:r>
-        <w:t>nd absent for R95p (r = −0.03). Projection magnitude also depends on the downscaling workflow: for five parent models common to NEX-GDDP-CMIP6 and ISIMIP3b, NEX-GDDP changes are 12–110 percentage points smaller in all ten parent–index comparisons, and four</w:t>
-      </w:r>
-      <w:r>
-        <w:t xml:space="preserve"> comparisons differ in sign (Supplementary Fig. S9).</w:t>
+        <w:t>Post-processing and physical sources of projection spread</w:t>
+      </w:r>
+    </w:p>
+    <w:p>
+      <w:pPr>
+        <w:pStyle w:val="NormalWeb"/>
+      </w:pPr>
+      <w:r>
+        <w:t>Across the 27 models available as both raw CMIP6 output and NEX-GDDP-CMIP6, bias-corrected downscaling substantially reduces between-model spread in present-day extremes. The coefficient of variation for wet-season Rx1day decreases from 0.463 to 0.178, retaining 14.8% of the normalised variance, while for R95p it decreases from 0.576 to 0.194, retaining 11.4% (Fig. 6; Supplementary Table S10). Correspondence between raw and downscaled present-day levels is weak for Rx1day (r = +0.26) and negligible for R95p (r = −0.03). Projected changes also depend on the downscaling workflow: among five parent models common to NEX-GDDP-CMIP6 and ISIMIP3b, NEX-GDDP changes are 12–110 percentage points smaller in all ten parent–index comparisons, with four comparisons differing in sign (Supplementary Fig. S9).</w:t>
+      </w:r>
+    </w:p>
+    <w:p>
+      <w:pPr>
+        <w:pStyle w:val="NormalWeb"/>
+      </w:pPr>
+      <w:r>
+        <w:t>The projected spread is also not explained by simple thermodynamic scaling. Under SSP5-8.5, partitioning projected change into Clausius–Clapeyron scaling of each model’s regional warming (7% per kelvin) and a residual shows that the residual accounts for 86.6–99.0% of the summed component variances (Supplementary Table S11; Supplementary Fig. S10). Projected change nevertheless scales with regional warming at 11.1–56.4% per kelvin, above the Clausius–</w:t>
+      </w:r>
+      <w:r>
+        <w:lastRenderedPageBreak/>
+        <w:t>Clapeyron rate, and all four index–domain relationships survive false-discovery control (Supplementary Fig. S11). Because projected regional warming is a model output rather than an observable predictor, these relationships characterise inter-model behaviour rather than provide an emergent constraint. Most component variance therefore lies outside the simple Clausius–Clapeyron thermodynamic contribution.</w:t>
+      </w:r>
+    </w:p>
+    <w:p>
+      <w:pPr>
+        <w:pStyle w:val="Heading1"/>
+      </w:pPr>
+      <w:r>
+        <w:t>Discussion</w:t>
+      </w:r>
+    </w:p>
+    <w:p>
+      <w:pPr>
+        <w:pStyle w:val="NormalWeb"/>
+      </w:pPr>
+      <w:r>
+        <w:t>Three measurable characteristics of the dataset account for the absence of a robust emergent constraint. The first is the sampling limitation. With one realisation per model and 25 seasons in each analysis period, finite-period sampling accounts for approximately one-quarter to one-half of the inter-model variance in absolute change. When projected change is normalised by a small historical baseline, within-model sampling variance can equal or exceed the variance across models. For an ensemble of 23 models, a correlation of approximately 0.56 is required to achieve 80% statistical power at the two-sided 5% significance level; this threshold increases to approximately 0.71 when the 13 genealogical families are treated as the effective sample size. Consequently, weaker relationships cannot be reliably distinguished from sampling variability within the present ensemble.</w:t>
+      </w:r>
+    </w:p>
+    <w:p>
+      <w:pPr>
+        <w:pStyle w:val="NormalWeb"/>
+      </w:pPr>
+      <w:r>
+        <w:t>The second characteristic is predictand construction. All 20 apparent successes across the two predictand formulations involved predictors that were algebraically embedded within the predictand. Their uniformly negative sign, concentration under SSP1-2.6, and persistence through conventional robustness procedures are consistent with this mathematical dependence. Expressing projected change in absolute rather than fractional terms may appear to alleviate problems associated with small and variable baselines, but the historical value remains a component of the projected-change calculation. Accordingly, absolute change did not eliminate the coupling and yielded more apparent relationships than fractional change. A robust constraint therefore requires a predictor that is mathematically independent of the predictand. Where such independence cannot be achieved, an explicit diagnostic of predictor–predictand coupling is necessary. For percentile-threshold indices, this diagnostic should be evaluated against an appropriate permutation null because the index is internally constrained over its calibration period and disjoint temporal subsets are therefore not statistically independent.</w:t>
+      </w:r>
+    </w:p>
+    <w:p>
+      <w:pPr>
+        <w:pStyle w:val="NormalWeb"/>
+      </w:pPr>
+      <w:r>
+        <w:t xml:space="preserve">The third characteristic is the post-processing procedure. Bias-corrected downscaling is intended to align each model’s present-day distribution more closely with observations, but this process can reduce the inter-model variability on which a present-day emergent constraint depends. Such a constraint requires systematic differences among models in the predictor and requires those differences to retain information relevant to future response. Following bias correction, neither condition is necessarily preserved. Maraun et al. [17] demonstrated that bias correction can modify a model’s climate-change signal in ways that are not detectable through present-day cross-validation. The present results provide a complementary cross-model perspective by showing that post-processing substantially reduces the between-model information available to a potential constraint. Because emergent-constraint studies generally analyse raw climate-model </w:t>
+      </w:r>
+      <w:r>
+        <w:lastRenderedPageBreak/>
+        <w:t>output, whereas impact assessments frequently employ downscaled products [18], this interaction has received limited direct evaluation. Some of the observed variance reduction may also arise from differences in spatial resolution between native and downscaled grids rather than from bias adjustment alone; regridding each downscaled product to its parent model resolution would help separate these contributions.</w:t>
+      </w:r>
+    </w:p>
+    <w:p>
+      <w:pPr>
+        <w:pStyle w:val="NormalWeb"/>
+      </w:pPr>
+      <w:r>
+        <w:t>These findings do not contradict emergent constraints established at broader spatial scales; rather, they identify conditions under which such constraints lose predictive utility. The constraints reported by Thackeray et al. [7], Shiogama et al. [8] and Chemke and Yuval [10] were derived from global or continental aggregates using raw model output. Li et al. [9] obtained a cross-validated local constraint by aggregating neighbouring grid cells and ensemble members to reduce internal variability, an approach that cannot be equivalently implemented here for a single hyperarid country represented by one realisation per model. Li et al. [16] likewise showed that historical model performance improves regional projections only when the performance metric is physically related to the future response and sufficiently separable from internal variability. The precipitation-independent PFS illustrates this distinction: it provides a robust ranking of models according to circulation and moisture-transport characteristics relevant to UAE rainfall, yet an unsigned distance from a present-day reference state has no prescribed relationship with the magnitude of future change. Similarly, after removal of simple Clausius–Clapeyron scaling, the residual accounts for 87–99% of the summed component variances. Relative to previous demonstrations that emergent constraints may fail across model generations or through structural misspecification [11–14], the present analysis identifies an additional failure mechanism arising from algebraic predictand construction and index calibration, together with a separate limitation introduced by the post-processing procedures used in climate-impact assessment.</w:t>
+      </w:r>
+    </w:p>
+    <w:p>
+      <w:pPr>
+        <w:pStyle w:val="NormalWeb"/>
+      </w:pPr>
+      <w:r>
+        <w:t>The observational analysis supports stronger inference regarding present-day spatial structure than long-term temporal change. Agreement among three gauge sources demonstrates that the west–east rainfall gradient is not an artefact of a single observational network or gridded product. The URCS provides a physical interpretation of this gradient: moisture transported from the Arabian Sea and Gulf of Oman reaches the eastern and northern emirates and interacts with the Hajar Mountains, consistent with analyses of the April 2024 rainfall event [1] and projected changes in regional moisture transport [2]. Gauge-anchored correction of satellite precipitation improved agreement at calibration locations but showed limited spatial transferability between stations. Local calibration performance should therefore not be interpreted as evidence of spatial predictive skill across heterogeneous hyperarid terrain. This finding extends previous UAE evaluations of satellite precipitation products [19] by distinguishing point-specific calibration performance from spatial transferability. The absence of a statistically robust 1982–2024 trend, together with the sensitivity of nominal significance to inclusion of the 2024 endpoint, is consistent with the strong influence of episodic extreme events on rainfall variability and does not contradict projected intensification under future climate conditions.</w:t>
+      </w:r>
+    </w:p>
+    <w:p>
+      <w:pPr>
+        <w:pStyle w:val="NormalWeb"/>
+      </w:pPr>
+      <w:r>
+        <w:lastRenderedPageBreak/>
+        <w:t>Four methodological requirements follow from these results. First, predictors should be mathematically independent of the predictand. Second, percentile-based indices should be calibrated out of sample to avoid dependence introduced by threshold estimation. Third, candidate relationships should be evaluated across multiple emission scenarios using an identical model ensemble, because reversals in correlation sign provide a direct diagnostic of relationship instability. Fourth, analyses using statistically downscaled ensembles should establish whether the between-model information required by the predictor remains preserved after post-processing. For the UAE, the observed rainfall gradient and associated Arabian Sea–Gulf of Oman moisture pathway support increased attention to the eastern and northern emirates in spatial hazard assessment. Future change should, however, be characterised using the full product-dependent ensemble distribution rather than substantially narrowed through selection based on present-day model performance. Model interdependence should also be accounted for, while physically based storylines provide a complementary framework for examining plausible outcomes [20,21]. A modest ensemble-mean change should not be interpreted as evidence of modest hazard because societal impacts are concentrated in the upper tail of the precipitation distribution.</w:t>
+      </w:r>
+    </w:p>
+    <w:p>
+      <w:pPr>
+        <w:pStyle w:val="NormalWeb"/>
+      </w:pPr>
+      <w:r>
+        <w:t>Several limitations constrain the interpretation of these findings. The PFS is derived from monthly atmospheric fields, with IVT approximated using four pressure levels, and therefore does not resolve event-scale storm occurrence, persistence or precipitation efficiency. The process-fidelity analysis is also restricted to 15 models and consequently has lower statistical power than the broader projection analysis. Only one realisation per model was available; seasonal resampling therefore provides a lower-bound estimate of internal variability rather than a complete characterisation based on initial-condition ensembles. The eastern domain contains 22 valid land cells and cannot resolve individual catchments within the Hajar Mountains. Gauge undercatch and station siting may affect absolute precipitation amounts, and the influence of operational cloud-seeding activities could not be quantified. Finally, the absence of a statistically robust constraint excludes only relationships sufficiently strong to be detected by the present ensemble. It does not exclude weaker relationships or constraints based on event-conditioned diagnostics, including extreme vapour transport, convective environments or sea-surface temperature. Evaluation of such mechanisms will require sub-daily multi-model atmospheric fields and initial-condition ensembles.</w:t>
+      </w:r>
+    </w:p>
+    <w:p>
+      <w:pPr>
+        <w:pStyle w:val="BodyText"/>
+      </w:pPr>
+      <w:r>
+        <w:t>In this hyperarid extreme-rainfall setting, the apparent emergent constraints were attributable to predictand construction, index calibration and finite-period sampling rather than demonstrable physical predictability, while bias-corrected downscaling substantially reduced the between-model information available to present-day predictors. More robust constraint of regional extreme-rainfall projections will therefore require reduced sampling uncertainty, physically interpretable and predictand-independent diagnostics, explicit consideration of event-scale processes, and systematic evaluation of the effects of post-processing, rather than reliance on present-day model performance alone</w:t>
+      </w:r>
+      <w:r>
+        <w:t>.</w:t>
+      </w:r>
+    </w:p>
+    <w:p>
+      <w:pPr>
+        <w:pStyle w:val="Heading1"/>
+      </w:pPr>
+      <w:r>
+        <w:lastRenderedPageBreak/>
+        <w:t>Methods</w:t>
       </w:r>
     </w:p>
     <w:p>
       <w:pPr>
         <w:pStyle w:val="Heading2"/>
       </w:pPr>
-      <w:r>
-        <w:t>Thermodynamic and dynamic contributions</w:t>
-      </w:r>
-    </w:p>
-    <w:p>
-      <w:pPr>
-        <w:pStyle w:val="BodyText"/>
-      </w:pPr>
-      <w:r>
-        <w:t>Partitioning projected change under SSP5-8.5 into Clausius–Clapeyron scaling of each model's own regional warming (7% per kelvin) and a residual shows that the res</w:t>
-      </w:r>
-      <w:r>
-        <w:t>idual accounts for 86.6–99.0% of the summed component variances (Supplementary Table S11; Supplementary Fig. S10). Projected change nevertheless scales with projected regional warming at 11.1–56.4% per kelvin, well above the Clausius–Clapeyron rate, and al</w:t>
-      </w:r>
-      <w:r>
-        <w:t>l four index–domain relationships survive false-discovery control (Supplementary Fig. S11). Regional warming is a model output rather than an observable, so this relationship characterises inter-model behaviour rather than constraining it. It shows that mo</w:t>
-      </w:r>
-      <w:r>
-        <w:t>st component variance lies outside the simple Clausius–Clapeyron thermodynamic contribution.</w:t>
-      </w:r>
-    </w:p>
-    <w:p>
-      <w:pPr>
-        <w:pStyle w:val="Heading1"/>
-      </w:pPr>
-      <w:r>
-        <w:t>Discussion</w:t>
-      </w:r>
-    </w:p>
-    <w:p>
-      <w:pPr>
-        <w:pStyle w:val="BodyText"/>
-      </w:pPr>
-      <w:r>
-        <w:t>Three measurable properties of the data, rather than deficiencies of individual predictors, account for the absence of a usable constraint. The first is</w:t>
-      </w:r>
-      <w:r>
-        <w:t xml:space="preserve"> the sampling floor. With one realisation per model and 25 seasons per period, finite-period sampling supplies a quarter to a half of inter-model spread in absolute change, and where change is expressed as a fraction of a small baseline the within-model sa</w:t>
-      </w:r>
-      <w:r>
-        <w:t xml:space="preserve">mpling variance can equal or exceed the spread across models. With 23 models, a correlation of about 0.56 is needed for 80% power at the two-sided 5% level, and about 0.71 if the 13 families are treated as the effective sample; weaker relationships cannot </w:t>
-      </w:r>
-      <w:r>
-        <w:t>be resolved by this ensemble whatever their physical reality.</w:t>
-      </w:r>
-    </w:p>
-    <w:p>
-      <w:pPr>
-        <w:pStyle w:val="BodyText"/>
-      </w:pPr>
-      <w:r>
-        <w:t>The second is predictand construction. Every one of the 20 apparent successes across the two predictand forms used a predictor algebraically embedded in the predictand, and their sign, their con</w:t>
-      </w:r>
-      <w:r>
-        <w:t xml:space="preserve">centration in the weakest-forcing pathway and their passage through every conventional robustness test all follow from that embedding. It is natural to respond to small, noisy baselines by testing constraints on absolute rather than fractional change; our </w:t>
-      </w:r>
-      <w:r>
-        <w:t xml:space="preserve">results show that this is insufficient, because absolute change retains the historical value as a subtrahend and admitted more spurious relationships than fractional change. The requirement is that the predictor not enter the predictand at all. Where that </w:t>
-      </w:r>
-      <w:r>
-        <w:t>is impossible, a coupling diagnostic is needed, and for percentile-threshold indices the diagnostic must be referred to a permutation null, because the index is internally constrained over its calibration period and disjoint subperiods are not independent.</w:t>
-      </w:r>
-    </w:p>
-    <w:p>
-      <w:pPr>
-        <w:pStyle w:val="BodyText"/>
-      </w:pPr>
-      <w:r>
-        <w:t>The third is the post-processing chain. Bias-corrected downscaling is designed to bring each model's present-day distribution toward observations, and the between-model spread in that distribution is precisely what it removes. A constraint built on a pres</w:t>
-      </w:r>
-      <w:r>
-        <w:t>ent-day predictor requires that models differ systematically in the predictor and that those differences carry information about the model; after bias correction neither condition holds. Maraun et al. [17] showed that bias correction can alter a model's ch</w:t>
-      </w:r>
-      <w:r>
-        <w:t>ange signal in ways that present-day cross-validation cannot detect; the result here is the complementary statement in the cross-model dimension. Because constraint studies work with raw output and impact studies with downscaled products [18], this interac</w:t>
-      </w:r>
-      <w:r>
-        <w:t>tion has not previously been quantified. Part of the variance reduction may reflect the difference in resolution between native and downscaled grids as well as bias adjustment; degrading the downscaled field to each parent grid would separate the two.</w:t>
-      </w:r>
-    </w:p>
-    <w:p>
-      <w:pPr>
-        <w:pStyle w:val="BodyText"/>
-      </w:pPr>
-      <w:r>
-        <w:t>Thes</w:t>
-      </w:r>
-      <w:r>
-        <w:t>e results do not contradict constraints established at larger scales; they locate the conditions under which the approach stops being informative. The constraints of Thackeray et al. [7], Shiogama et al. [8] and Chemke and Yuval [10] are established on glo</w:t>
-      </w:r>
-      <w:r>
-        <w:t>bal or continental aggregates using raw model output. Li et al. [9] obtain a cross-validated local constraint by aggregating neighbouring grid cells and ensemble members to suppress internal variability, which is the step a single hyperarid country with on</w:t>
-      </w:r>
-      <w:r>
-        <w:t xml:space="preserve">e realisation per model cannot take. Li et al. [16] similarly find that model performance improves regional projections only where the performance metric is tied to the future response and separable from internal variability. The precipitation-independent </w:t>
-      </w:r>
-      <w:r>
-        <w:t xml:space="preserve">PFS illustrates the latter point: it ranks models robustly on the circulation that produces UAE rainfall, yet an unsigned distance from a present-day reference has no prescribed relationship with forced change. In the thermodynamic partition, the residual </w:t>
-      </w:r>
-      <w:r>
-        <w:t>accounts for 87–99% of the summed component variances after simple Clausius–Clapeyron scaling is removed. Relative to earlier demonstrations that constraints can fail across model generations or through structural misspecification [11–14], the present anal</w:t>
-      </w:r>
-      <w:r>
-        <w:t>ysis adds a failure mode that is arithmetic, arising from predictand and index construction, and one introduced by the post-processing on which impact assessment relies.</w:t>
-      </w:r>
-    </w:p>
-    <w:p>
-      <w:pPr>
-        <w:pStyle w:val="BodyText"/>
-      </w:pPr>
-      <w:r>
-        <w:t>The observational analysis supports a firmer statement about the present than about th</w:t>
-      </w:r>
-      <w:r>
-        <w:t>e future. Agreement among three gauge networks shows that the west–east gradient is not an artefact of one network or gridded product. The URCS places this gradient in a physical context: moisture carried from the Arabian Sea and Gulf of Oman meets the Haj</w:t>
-      </w:r>
-      <w:r>
-        <w:t>ar Mountains in the eastern and northern emirates, consistent with analyses of the April 2024 storm [1] and projected changes in regional moisture transport [2]. Gauge-anchored correction of satellite–gauge rainfall improved agreement at the calibration si</w:t>
-      </w:r>
-      <w:r>
-        <w:t>tes but did not transfer between them. Local calibration accuracy should therefore not be interpreted as spatial skill in heterogeneous hyperarid terrain; this extends earlier UAE evaluations of satellite products [19] by separating the two properties. The</w:t>
-      </w:r>
-      <w:r>
-        <w:t xml:space="preserve"> absence of a robust 1982–2024 trend, with nominal results appearing or disappearing with the 2024 endpoint, is expected in an event-dominated climate and does not contradict projected intensification.</w:t>
-      </w:r>
-    </w:p>
-    <w:p>
-      <w:pPr>
-        <w:pStyle w:val="BodyText"/>
-      </w:pPr>
-      <w:r>
-        <w:t>Four practices follow for constraint analysis generall</w:t>
-      </w:r>
-      <w:r>
-        <w:t>y: predictors external to the predictand; out-of-sample calibration of percentile-based indices; evaluation across more than one forcing pathway on a fixed model set, since sign reversal is inexpensive to test and highly diagnostic; and, for downscaled ens</w:t>
-      </w:r>
-      <w:r>
-        <w:t>embles, confirmation that the between-model information a predictor requires has survived post-processing. For the UAE, the gauge gradient and its Arabian Sea–Gulf of Oman moisture pathway justify greater attention to the eastern and northern emirates in s</w:t>
-      </w:r>
-      <w:r>
-        <w:t>patial hazard assessment, whereas future change should be represented by the full, product-dependent ensemble range rather than narrowed by model selection, with model interdependence accounted for and physical storylines used to explore plausible outcomes</w:t>
-      </w:r>
-      <w:r>
-        <w:t xml:space="preserve"> [20,21]. The modest ensemble-mean change does not imply modest risk, because impacts are concentrated in the upper tail.</w:t>
-      </w:r>
-    </w:p>
-    <w:p>
-      <w:pPr>
-        <w:pStyle w:val="BodyText"/>
-      </w:pPr>
-      <w:r>
-        <w:t>The analysis has limits. The PFS is computed from monthly fields with IVT approximated on four pressure levels, so it does not resolve</w:t>
-      </w:r>
-      <w:r>
-        <w:t xml:space="preserve"> storm occurrence, persistence or precipitation efficiency, and it rests on 15 models, making it the least well-powered element. Only one realisation per model was available, so resampling gives a lower bound on internal variability. The eastern domain con</w:t>
-      </w:r>
-      <w:r>
-        <w:t xml:space="preserve">tains 22 land cells and cannot resolve individual Hajar Mountains catchments. Gauge undercatch and siting affect absolute observed amounts, and the influence of operational cloud seeding could not be assessed. The null result excludes relationships strong </w:t>
-      </w:r>
-      <w:r>
-        <w:t>enough to be resolved by this ensemble; it does not exclude weaker relationships, or constraints based on event-conditioned diagnostics such as extreme vapour transport, convective environments or sea-surface temperature, which require sub-daily multi-mode</w:t>
-      </w:r>
-      <w:r>
-        <w:t>l fields and initial-condition ensembles and are the clear next step.</w:t>
-      </w:r>
-    </w:p>
-    <w:p>
-      <w:pPr>
-        <w:pStyle w:val="BodyText"/>
-      </w:pPr>
-      <w:r>
-        <w:t>In a hyperarid extreme-rainfall setting, apparent emergent constraints arose from predictand construction, index calibration and sampling variability rather than from physical predictabi</w:t>
-      </w:r>
-      <w:r>
-        <w:t>lity, and bias-corrected downscaling removed the between-model information that a present-day predictor would need. Narrowing projections of hyperarid extreme rainfall will depend on lowering the sampling floor, on event-conditioned diagnostics and on atte</w:t>
-      </w:r>
-      <w:r>
-        <w:t>ntion to the post-processing chain, rather than on selecting models by present-day skill.</w:t>
-      </w:r>
-    </w:p>
-    <w:p>
-      <w:pPr>
-        <w:pStyle w:val="Heading1"/>
-      </w:pPr>
-      <w:r>
-        <w:t>Methods</w:t>
+      <w:bookmarkStart w:id="1" w:name="study-area-and-analytical-framework"/>
+      <w:r>
+        <w:t>Study area and analytical framework</w:t>
+      </w:r>
+      <w:bookmarkEnd w:id="1"/>
+    </w:p>
+    <w:p>
+      <w:pPr>
+        <w:pStyle w:val="FirstParagraph"/>
+      </w:pPr>
+      <w:r>
+        <w:t>The UAE occupies the south-eastern Arabian Peninsula (22.6–26.1°N, 51.5–56.5°E; Fig. 1), between the Arabian Gulf and the Gulf of Oman. Sand deserts dominate the west and south, whereas the Hajar Mountains along the eastern border reach approximately 1,900 m at Jebel Jais. Annual rainfall is generally below 120 mm yr−1, occurs predominantly from November to April, and is concentrated in a small number of synoptically driven events.</w:t>
+      </w:r>
+    </w:p>
+    <w:p>
+      <w:pPr>
+        <w:pStyle w:val="BodyText"/>
+      </w:pPr>
+      <w:r>
+        <w:t>The analysis separates evidence by spatial support and function (Supplementary Fig. S12). Gauge records establish the observed climatology and west–east gradient. Gauge-anchored CHIRPS provides climatological spatial completion, conditional on transferability between stations. ERA5 circulation and moisture fields define a precipitation-independent process reference for model evaluation, whereas downscaled CMIP6 products provide the future-change predictands. Cross-validation, false-discovery control, and construction-sensitivity tests determine which inferences are supported.</w:t>
       </w:r>
     </w:p>
     <w:p>
       <w:pPr>
         <w:pStyle w:val="Heading2"/>
       </w:pPr>
-      <w:bookmarkStart w:id="1" w:name="study-area-and-analytical-framework"/>
-      <w:r>
-        <w:t>Study area and analytical framework</w:t>
-      </w:r>
-      <w:bookmarkEnd w:id="1"/>
-    </w:p>
-    <w:p>
-      <w:pPr>
-        <w:pStyle w:val="FirstParagraph"/>
-      </w:pPr>
-      <w:r>
-        <w:t>The UAE occupies the south-eastern Arabian Peninsula (22.6–26.1°N, 51.5–56.5°E; Fig. 1), between the Arabian Gulf and the Gulf of Oman. Sand deserts dominate the west and south, whereas the Hajar Mountains along the eastern border reach approximately 1,900 m at Jebel Jais. Annual rainfall is generally below 120 mm yr−1, occurs predominantly from November to April, and is concentrated in a small number of synoptically driven events.</w:t>
-      </w:r>
-    </w:p>
-    <w:p>
-      <w:pPr>
-        <w:pStyle w:val="BodyText"/>
-      </w:pPr>
-      <w:r>
-        <w:t>The analysis separates evidence by spatial support and function (Supplementary Fig. S12). Gauge records establish the observed climatology and west–east gradient. Gauge-anchored CHIRPS provides climatological spatial completion, conditional on transferability between stations. ERA5 circulation and moisture fields define a precipitation-independent process reference for model evaluation, whereas downscaled CMIP6 products provide the future-change predictands. Cross-validation, false-discovery control, and construction-sensitivity tests determine which inferences are supported.</w:t>
-      </w:r>
-    </w:p>
-    <w:p>
-      <w:pPr>
-        <w:pStyle w:val="Heading2"/>
-      </w:pPr>
       <w:bookmarkStart w:id="2" w:name="X8e760b2edaf3b59c18d197f92563dfd18e61266"/>
       <w:r>
         <w:t>Observations, gridded products, and climate simulations</w:t>
@@ -765,6 +544,7 @@
         <w:pStyle w:val="BodyText"/>
       </w:pPr>
       <w:r>
+        <w:lastRenderedPageBreak/>
         <w:t>Historical monthly fields were obtained from 22 Coupled Model Intercomparison Project Phase 6 (CMIP6) models on their native grids for 1990–2014 [27]. Twenty-one models were scored after ACCESS-CM2 was excluded because of a time-coordinate fault (Supplementary Data 2). Projection predictands came from daily NEX-GDDP-CMIP6 precipitation (0.25°) [28]. ISIMIP3b daily precipitation (0.5°) [29] was analysed for five common parent models. One ensemble member was retained per model (r1i1p1f1 where available; the member used for every model is listed in Supplementary Data 2), and native-grid cells were assigned to GADM v4.1 regions by point-in-polygon.</w:t>
       </w:r>
     </w:p>
@@ -790,30 +570,19 @@
         <w:pStyle w:val="BodyText"/>
       </w:pPr>
       <w:r>
-        <w:t>Daily precipitation was</w:t>
-      </w:r>
-      <w:r>
-        <w:t xml:space="preserve"> taken from NEX-GDDP-CMIP6 for the historical experiment and for SSP1-2.6, SSP2-4.5, SSP3-7.0 and SSP5-8.5. Wet seasons run from November to April and are labelled by the January year; the historical period comprises the 25 seasons 1990–2014 and the future</w:t>
-      </w:r>
-      <w:r>
-        <w:t xml:space="preserve"> period the 25 seasons 2076–2100. Indices were computed on the model's own calendar, read from the time axis of each file rather than inferred from array length, because several models are archived with 364-day years. The 23-model common set is used for ev</w:t>
-      </w:r>
-      <w:r>
-        <w:t>ery cross-scenario comparison, so that scenario differences cannot arise from changes in ensemble composition.</w:t>
-      </w:r>
-    </w:p>
-    <w:p>
-      <w:pPr>
-        <w:pStyle w:val="BodyText"/>
-      </w:pPr>
-      <w:r>
-        <w:t xml:space="preserve">Two domains are used: a national domain spanning 22.2–26.5 degrees N and 51.2–57.6 degrees E, and an eastern domain spanning 24.6–26.5 degrees N </w:t>
-      </w:r>
-      <w:r>
-        <w:t>and 55.7–56.6 degrees E that isolates the Hajar Mountains and their forelands. NEX-GDDP-CMIP6 is defined over land only, so the national box contains 295 valid cells of 425 and the eastern box 22 of 24. Domain means are taken over valid cells; cells withou</w:t>
-      </w:r>
-      <w:r>
-        <w:t>t data are excluded rather than treated as zero.</w:t>
+        <w:t>Daily precipitation was taken from NEX-GDDP-CMIP6 for the historical experiment and for SSP1-2.6, SSP2-4.5, SSP3-7.0 and SSP5-8.5. Wet seasons run from November to April and are labelled by the January year; the historical period comprises the 25 seasons 1990–2014 and the future period the 25 seasons 2076–2100. Indices were computed on the model's own calendar, read from the time axis of each file rather than inferred from array length, because several models are archived with 364-day years. The 23-model common set is used for every cross-scenario comparison, so that scenario differences cannot arise from changes in ensemble composition.</w:t>
+      </w:r>
+    </w:p>
+    <w:p>
+      <w:pPr>
+        <w:pStyle w:val="BodyText"/>
+      </w:pPr>
+      <w:r>
+        <w:t xml:space="preserve">Two domains are used: a national domain spanning 22.2–26.5 degrees N and 51.2–57.6 degrees E, and an eastern domain spanning 24.6–26.5 degrees N and 55.7–56.6 degrees E that isolates the Hajar Mountains and their forelands. NEX-GDDP-CMIP6 is defined over land only, so the national box contains 295 valid cells of 425 and the eastern box 22 of 24. </w:t>
+      </w:r>
+      <w:r>
+        <w:lastRenderedPageBreak/>
+        <w:t>Domain means are taken over valid cells; cells without data are excluded rather than treated as zero.</w:t>
       </w:r>
     </w:p>
     <w:p>
@@ -1607,27 +1376,19 @@
         <w:pStyle w:val="BodyText"/>
       </w:pPr>
       <w:r>
-        <w:t>Rx1day is the wet-season maximum one-day accumulation and Rx5day the maximum five-day accumulation, each computed p</w:t>
-      </w:r>
-      <w:r>
-        <w:t xml:space="preserve">er cell and then averaged over the domain. PRCPTOT is the wet-season accumulation on wet days, defined as days of at least 1 mm, and wet-day frequency is the count of such days. R95p and R99p are the accumulations on days exceeding, respectively, the 95th </w:t>
-      </w:r>
-      <w:r>
-        <w:t>and 99th percentile of historical wet-day precipitation, with the threshold estimated per cell over 1990–2014 and held fixed for the future period so that changes reflect the distribution rather than a moving threshold.</w:t>
-      </w:r>
-    </w:p>
-    <w:p>
-      <w:pPr>
-        <w:pStyle w:val="BodyText"/>
-      </w:pPr>
-      <w:r>
-        <w:t xml:space="preserve">A threshold estimated over the same </w:t>
-      </w:r>
-      <w:r>
-        <w:t>seasons from which the index is then computed constrains that index: the total exceedance over the calibration record is close to fixed, so disjoint subperiods of the record must trade off against one another. To quantify this, R95p was computed a second t</w:t>
-      </w:r>
-      <w:r>
-        <w:t>ime with the threshold estimated from the 13 odd-numbered historical seasons alone, leaving the remaining seasons and the entire future period out of sample.</w:t>
+        <w:t>Rx1day is the wet-season maximum one-day accumulation and Rx5day the maximum five-day accumulation, each computed per cell and then averaged over the domain. PRCPTOT is the wet-season accumulation on wet days, defined as days of at least 1 mm, and wet-day frequency is the count of such days. R95p and R99p are the accumulations on days exceeding, respectively, the 95th and 99th percentile of historical wet-day precipitation, with the threshold estimated per cell over 1990–2014 and held fixed for the future period so that changes reflect the distribution rather than a moving threshold.</w:t>
+      </w:r>
+    </w:p>
+    <w:p>
+      <w:pPr>
+        <w:pStyle w:val="BodyText"/>
+      </w:pPr>
+      <w:r>
+        <w:t xml:space="preserve">A threshold estimated over the same seasons from which the index is then computed constrains that index: the total exceedance over the calibration record is close to fixed, so disjoint subperiods of the record must trade off against one another. To quantify this, R95p was computed a second time with the threshold estimated from the 13 odd-numbered </w:t>
+      </w:r>
+      <w:r>
+        <w:lastRenderedPageBreak/>
+        <w:t>historical seasons alone, leaving the remaining seasons and the entire future period out of sample.</w:t>
       </w:r>
     </w:p>
     <w:p>
@@ -3664,7 +3425,11 @@
         <w:pStyle w:val="BodyText"/>
       </w:pPr>
       <w:r>
-        <w:t>Four further analyses were performed. To estimate the contribution of finite-period sampling, the 25 seasons of each model and period were resampled with replacement 5,000 times and projected change was recomputed. The mean squared within-model sampling standard deviation was then compared with the variance of projected change across models. This partition was computed for both absolute and fractional change because the two behave differently where the baseline is small.</w:t>
+        <w:t xml:space="preserve">Four further analyses were performed. To estimate the contribution of finite-period sampling, the 25 seasons of each model and period were resampled with replacement 5,000 times and projected change was recomputed. The mean squared within-model sampling standard deviation was then compared with the variance of projected change </w:t>
+      </w:r>
+      <w:r>
+        <w:lastRenderedPageBreak/>
+        <w:t>across models. This partition was computed for both absolute and fractional change because the two behave differently where the baseline is small.</w:t>
       </w:r>
     </w:p>
     <w:p>
@@ -3696,36 +3461,19 @@
         <w:pStyle w:val="BodyText"/>
       </w:pPr>
       <w:r>
-        <w:t xml:space="preserve">Eleven predictors were specified before any constraint test was run, in three families. Family A is atmospheric process fidelity, represented by the Process Fidelity Score. Family B describes the present-day </w:t>
-      </w:r>
-      <w:r>
-        <w:t>extreme-rainfall state: Rx1day climatology, R95p climatology, R99p climatology, the tail concentration R95p/PRCPTOT, the event-duration ratio Rx5day/Rx1day, and wet-day frequency. Wet-day frequency is retained as an interpretive contrast rather than a cand</w:t>
-      </w:r>
-      <w:r>
-        <w:t>idate, since a constraint operating through wet-day counts rather than event intensity would carry a different physical meaning. Family C describes present-day variability and historical change: the interannual standard deviation of Rx1day and of R95p, and</w:t>
-      </w:r>
-      <w:r>
-        <w:t xml:space="preserve"> the Theil-Sen trend in each index over the 25 historical seasons.</w:t>
-      </w:r>
-    </w:p>
-    <w:p>
-      <w:pPr>
-        <w:pStyle w:val="BodyText"/>
-      </w:pPr>
-      <w:r>
-        <w:t>Each predictor was tested against projected change in Rx1day and in R95p, for both domains and all four scenarios, giving 176 tests. The full grid was evaluated twice, once with change expr</w:t>
-      </w:r>
-      <w:r>
-        <w:t>essed as an absolute difference and once as a fraction of the historical baseline. For every test we report the Pearson correlation, a permutation probability from 5,000 relabellings, leave-one-family-out cross-validated skill, and bootstrap sign stability</w:t>
-      </w:r>
-      <w:r>
-        <w:t xml:space="preserve"> from 1,000 resamples. Benjamini-Hochberg control was applied once across the whole grid rather than within scenarios or families. A test was considered to satisfy the pre-specified criteria only if its false-discovery-adjusted probability was below 0.05, </w:t>
-      </w:r>
-      <w:r>
-        <w:t>its leave-one-family-out skill was positive, and its sign stability exceeded 0.9. Predictors were additionally classified by whether the quantity used as predictor also enters the construction of the predictand. The correlation detectable with 80% power at</w:t>
-      </w:r>
-      <w:r>
-        <w:t xml:space="preserve"> the two-sided 5% level was obtained from the Fisher transformation, using both the number of models and the number of families as the sample size.</w:t>
+        <w:t xml:space="preserve">Eleven predictors were specified before any constraint test was run, in three families. Family A is atmospheric process fidelity, represented by the Process Fidelity Score. Family B describes the present-day extreme-rainfall state: Rx1day climatology, R95p climatology, R99p climatology, the tail concentration R95p/PRCPTOT, the event-duration ratio </w:t>
+      </w:r>
+      <w:r>
+        <w:lastRenderedPageBreak/>
+        <w:t>Rx5day/Rx1day, and wet-day frequency. Wet-day frequency is retained as an interpretive contrast rather than a candidate, since a constraint operating through wet-day counts rather than event intensity would carry a different physical meaning. Family C describes present-day variability and historical change: the interannual standard deviation of Rx1day and of R95p, and the Theil-Sen trend in each index over the 25 historical seasons.</w:t>
+      </w:r>
+    </w:p>
+    <w:p>
+      <w:pPr>
+        <w:pStyle w:val="BodyText"/>
+      </w:pPr>
+      <w:r>
+        <w:t>Each predictor was tested against projected change in Rx1day and in R95p, for both domains and all four scenarios, giving 176 tests. The full grid was evaluated twice, once with change expressed as an absolute difference and once as a fraction of the historical baseline. For every test we report the Pearson correlation, a permutation probability from 5,000 relabellings, leave-one-family-out cross-validated skill, and bootstrap sign stability from 1,000 resamples. Benjamini-Hochberg control was applied once across the whole grid rather than within scenarios or families. A test was considered to satisfy the pre-specified criteria only if its false-discovery-adjusted probability was below 0.05, its leave-one-family-out skill was positive, and its sign stability exceeded 0.9. Predictors were additionally classified by whether the quantity used as predictor also enters the construction of the predictand. The correlation detectable with 80% power at the two-sided 5% level was obtained from the Fisher transformation, using both the number of models and the number of families as the sample size.</w:t>
       </w:r>
     </w:p>
     <w:p>
@@ -3741,33 +3489,15 @@
         <w:pStyle w:val="FirstParagraph"/>
       </w:pPr>
       <w:r>
-        <w:t>All gridded and reanalysis datasets used in this study are publicly available from their r</w:t>
-      </w:r>
-      <w:r>
-        <w:t>espective providers: CHIRPS from the Climate Hazards Center (https://www.chc.ucsb.edu/data/chirps), ERA5 from the Copernicus Climate Change Service Climate Data Store (https://cds.climate.copernicus.eu), MERRA-2 from the NASA Goddard Earth Sciences Data an</w:t>
-      </w:r>
-      <w:r>
-        <w:t>d Information Services Center (https://disc.gsfc.nasa.gov), JRA-55 from the NCAR Research Data Archive (https://rda.ucar.edu), GSOD from the NOAA National Centers for Environmental Information (https://www.ncei.noaa.gov), NEX-GDDP-CMIP6 from the NASA Cente</w:t>
-      </w:r>
-      <w:r>
-        <w:t>r for Climate Simulation (https://www.nccs.nasa.gov/services/data-collections/land-based-products/nex-gddp-cmip6), ISIMIP3b from the ISIMIP data repository (https://data.isimip.org), raw CMIP6 output from the Earth System Grid Federation (https://esgf.llnl</w:t>
-      </w:r>
-      <w:r>
-        <w:t>.gov), and administrative boundaries from GADM (https://gadm.org).</w:t>
-      </w:r>
-    </w:p>
-    <w:p>
-      <w:pPr>
-        <w:pStyle w:val="BodyText"/>
-      </w:pPr>
-      <w:r>
-        <w:t>The daily station records for the United Arab Emirates were supplied by the UAE National Center of Meteorology and are subject to the provider’s access conditions; they cannot be redistribu</w:t>
-      </w:r>
-      <w:r>
-        <w:t>ted by the authors, and requests should be directed to the National Center of Meteorology. The derived seasonal index series, the model manifest listing every simulation, ensemble member, Process Fidelity Score and documented exclusion, and all tabulated s</w:t>
-      </w:r>
-      <w:r>
-        <w:t>tatistics reported in the paper are provided with the analysis code. The results of every constraint test and the model inventory are provided as Supplementary Data 1 and 2.</w:t>
+        <w:t>All gridded and reanalysis datasets used in this study are publicly available from their respective providers: CHIRPS from the Climate Hazards Center (https://www.chc.ucsb.edu/data/chirps), ERA5 from the Copernicus Climate Change Service Climate Data Store (https://cds.climate.copernicus.eu), MERRA-2 from the NASA Goddard Earth Sciences Data and Information Services Center (https://disc.gsfc.nasa.gov), JRA-55 from the NCAR Research Data Archive (https://rda.ucar.edu), GSOD from the NOAA National Centers for Environmental Information (https://www.ncei.noaa.gov), NEX-GDDP-CMIP6 from the NASA Center for Climate Simulation (https://www.nccs.nasa.gov/services/data-collections/land-based-products/nex-gddp-cmip6), ISIMIP3b from the ISIMIP data repository (https://data.isimip.org), raw CMIP6 output from the Earth System Grid Federation (https://esgf.llnl.gov), and administrative boundaries from GADM (https://gadm.org).</w:t>
+      </w:r>
+    </w:p>
+    <w:p>
+      <w:pPr>
+        <w:pStyle w:val="BodyText"/>
+      </w:pPr>
+      <w:r>
+        <w:t>The daily station records for the United Arab Emirates were supplied by the UAE National Center of Meteorology and are subject to the provider’s access conditions; they cannot be redistributed by the authors, and requests should be directed to the National Center of Meteorology. The derived seasonal index series, the model manifest listing every simulation, ensemble member, Process Fidelity Score and documented exclusion, and all tabulated statistics reported in the paper are provided with the analysis code. The results of every constraint test and the model inventory are provided as Supplementary Data 1 and 2.</w:t>
       </w:r>
     </w:p>
     <w:p>
@@ -3775,6 +3505,7 @@
         <w:pStyle w:val="Heading1"/>
       </w:pPr>
       <w:r>
+        <w:lastRenderedPageBreak/>
         <w:t>Code availability</w:t>
       </w:r>
     </w:p>
@@ -3783,13 +3514,7 @@
         <w:pStyle w:val="BodyText"/>
       </w:pPr>
       <w:r>
-        <w:t xml:space="preserve">The analyses were carried out in Python 3 using NumPy, </w:t>
-      </w:r>
-      <w:r>
-        <w:t>pandas, netCDF4 and Matplotlib. The complete analysis code, the derived seasonal index series for every model and scenario, and the scripts that generate every figure and table will be deposited in a public Zenodo repository and assigned a DOI before publi</w:t>
-      </w:r>
-      <w:r>
-        <w:t>cation, and are available from the corresponding author on request during review. All resampling, permutation, bootstrap and cross-validation procedures use the fixed random seed 20260918, so the reported statistics are exactly reproducible.</w:t>
+        <w:t>The analyses were carried out in Python 3 using NumPy, pandas, netCDF4 and Matplotlib. The complete analysis code, the derived seasonal index series for every model and scenario, and the scripts that generate every figure and table will be deposited in a public Zenodo repository and assigned a DOI before publication, and are available from the corresponding author on request during review. All resampling, permutation, bootstrap and cross-validation procedures use the fixed random seed 20260918, so the reported statistics are exactly reproducible.</w:t>
       </w:r>
     </w:p>
     <w:p>
@@ -3831,10 +3556,7 @@
         <w:pStyle w:val="BodyText"/>
       </w:pPr>
       <w:r>
-        <w:t>2. Patha</w:t>
-      </w:r>
-      <w:r>
-        <w:t xml:space="preserve">k, R. et al. Dynamics of intensification of extreme precipitation events over the Arabian Peninsula derived from CMIP6 simulations. </w:t>
+        <w:t xml:space="preserve">2. Pathak, R. et al. Dynamics of intensification of extreme precipitation events over the Arabian Peninsula derived from CMIP6 simulations. </w:t>
       </w:r>
       <w:r>
         <w:rPr>
@@ -3860,10 +3582,7 @@
         <w:pStyle w:val="BodyText"/>
       </w:pPr>
       <w:r>
-        <w:t>3. Rao, K. K. et al. Future changes in the p</w:t>
-      </w:r>
-      <w:r>
-        <w:t xml:space="preserve">recipitation regime over the Arabian Peninsula with special emphasis on UAE: insights from NEX-GDDP CMIP6 model simulations. </w:t>
+        <w:t xml:space="preserve">3. Rao, K. K. et al. Future changes in the precipitation regime over the Arabian Peninsula with special emphasis on UAE: insights from NEX-GDDP CMIP6 model simulations. </w:t>
       </w:r>
       <w:r>
         <w:rPr>
@@ -3889,10 +3608,7 @@
         <w:pStyle w:val="BodyText"/>
       </w:pPr>
       <w:r>
-        <w:t xml:space="preserve">4. Hall, A., Cox, P., Huntingford, C. &amp; Klein, S. Progressing </w:t>
-      </w:r>
-      <w:r>
-        <w:t xml:space="preserve">emergent constraints on future climate change. </w:t>
+        <w:t xml:space="preserve">4. Hall, A., Cox, P., Huntingford, C. &amp; Klein, S. Progressing emergent constraints on future climate change. </w:t>
       </w:r>
       <w:r>
         <w:rPr>
@@ -3924,13 +3640,33 @@
         <w:rPr>
           <w:i/>
         </w:rPr>
-        <w:t>Adv. Atmo</w:t>
+        <w:t>Adv. Atmos. Sci.</w:t>
+      </w:r>
+      <w:r>
+        <w:t xml:space="preserve"> </w:t>
+      </w:r>
+      <w:r>
+        <w:rPr>
+          <w:b/>
+        </w:rPr>
+        <w:t>37</w:t>
+      </w:r>
+      <w:r>
+        <w:t>, 1–15 (2020). https://doi.org/10.1007/s00376-019-9140-8</w:t>
+      </w:r>
+    </w:p>
+    <w:p>
+      <w:pPr>
+        <w:pStyle w:val="BodyText"/>
+      </w:pPr>
+      <w:r>
+        <w:t xml:space="preserve">6. Zhang, W., Furtado, K., Zhou, T., Wu, P. &amp; Chen, X. Constraining extreme precipitation projections using past precipitation variability. </w:t>
       </w:r>
       <w:r>
         <w:rPr>
           <w:i/>
         </w:rPr>
-        <w:t>s. Sci.</w:t>
+        <w:t>Nat. Commun.</w:t>
       </w:r>
       <w:r>
         <w:t xml:space="preserve"> </w:t>
@@ -3939,24 +3675,285 @@
         <w:rPr>
           <w:b/>
         </w:rPr>
+        <w:t>13</w:t>
+      </w:r>
+      <w:r>
+        <w:t>, 6319 (2022). https://doi.org/10.1038/s41467-022-34006-0</w:t>
+      </w:r>
+    </w:p>
+    <w:p>
+      <w:pPr>
+        <w:pStyle w:val="BodyText"/>
+      </w:pPr>
+      <w:r>
+        <w:t xml:space="preserve">7. Thackeray, C. W., Hall, A., Norris, J. &amp; Chen, D. Constraining the increased frequency of global precipitation extremes under warming. </w:t>
+      </w:r>
+      <w:r>
+        <w:rPr>
+          <w:i/>
+        </w:rPr>
+        <w:t>Nat. Clim. Change</w:t>
+      </w:r>
+      <w:r>
+        <w:t xml:space="preserve"> </w:t>
+      </w:r>
+      <w:r>
+        <w:rPr>
+          <w:b/>
+        </w:rPr>
+        <w:t>12</w:t>
+      </w:r>
+      <w:r>
+        <w:t>, 441–448 (2022). https://doi.org/10.1038/s41558-022-01329-1</w:t>
+      </w:r>
+    </w:p>
+    <w:p>
+      <w:pPr>
+        <w:pStyle w:val="BodyText"/>
+      </w:pPr>
+      <w:r>
+        <w:t xml:space="preserve">8. Shiogama, H. et al. Combined emergent constraints on future extreme precipitation changes. </w:t>
+      </w:r>
+      <w:r>
+        <w:rPr>
+          <w:i/>
+        </w:rPr>
+        <w:t>Nat. Commun.</w:t>
+      </w:r>
+      <w:r>
+        <w:t xml:space="preserve"> </w:t>
+      </w:r>
+      <w:r>
+        <w:rPr>
+          <w:b/>
+        </w:rPr>
+        <w:t>16</w:t>
+      </w:r>
+      <w:r>
+        <w:t>, 5293 (2025). https://doi.org/10.1038/s41467-025-60385-1</w:t>
+      </w:r>
+    </w:p>
+    <w:p>
+      <w:pPr>
+        <w:pStyle w:val="BodyText"/>
+      </w:pPr>
+      <w:r>
+        <w:t xml:space="preserve">9. Li, C., Liu, J., Du, F., Zwiers, F. W. &amp; Feng, G. Increasing certainty in projected local extreme precipitation change. </w:t>
+      </w:r>
+      <w:r>
+        <w:rPr>
+          <w:i/>
+        </w:rPr>
+        <w:t>Nat. Commun.</w:t>
+      </w:r>
+      <w:r>
+        <w:t xml:space="preserve"> </w:t>
+      </w:r>
+      <w:r>
+        <w:rPr>
+          <w:b/>
+        </w:rPr>
+        <w:t>16</w:t>
+      </w:r>
+      <w:r>
+        <w:t>, 850 (2025). https://doi.org/10.1038/s41467-025-56235-9</w:t>
+      </w:r>
+    </w:p>
+    <w:p>
+      <w:pPr>
+        <w:pStyle w:val="BodyText"/>
+      </w:pPr>
+      <w:r>
+        <w:lastRenderedPageBreak/>
+        <w:t xml:space="preserve">10. Chemke, R. &amp; Yuval, J. Atmospheric circulation to constrain subtropical precipitation projections. </w:t>
+      </w:r>
+      <w:r>
+        <w:rPr>
+          <w:i/>
+        </w:rPr>
+        <w:t>Nat. Clim. Change</w:t>
+      </w:r>
+      <w:r>
+        <w:t xml:space="preserve"> </w:t>
+      </w:r>
+      <w:r>
+        <w:rPr>
+          <w:b/>
+        </w:rPr>
+        <w:t>15</w:t>
+      </w:r>
+      <w:r>
+        <w:t>, 287–292 (2025). https://doi.org/10.1038/s41558-025-02266-5</w:t>
+      </w:r>
+    </w:p>
+    <w:p>
+      <w:pPr>
+        <w:pStyle w:val="BodyText"/>
+      </w:pPr>
+      <w:r>
+        <w:t xml:space="preserve">11. Schlund, M., Lauer, A., Gentine, P., Sherwood, S. C. &amp; Eyring, V. Emergent constraints on equilibrium climate sensitivity in CMIP5: do they hold for CMIP6? </w:t>
+      </w:r>
+      <w:r>
+        <w:rPr>
+          <w:i/>
+        </w:rPr>
+        <w:t>Earth Syst. Dyn.</w:t>
+      </w:r>
+      <w:r>
+        <w:t xml:space="preserve"> </w:t>
+      </w:r>
+      <w:r>
+        <w:rPr>
+          <w:b/>
+        </w:rPr>
+        <w:t>11</w:t>
+      </w:r>
+      <w:r>
+        <w:t>, 1233–1258 (2020). https://doi.org/10.5194/esd-11-1233-2020</w:t>
+      </w:r>
+    </w:p>
+    <w:p>
+      <w:pPr>
+        <w:pStyle w:val="BodyText"/>
+      </w:pPr>
+      <w:r>
+        <w:t xml:space="preserve">12. Simpson, I. R. et al. Emergent constraints on the large-scale atmospheric circulation and regional hydroclimate: Do they still work in CMIP6 and how much can they actually constrain the future? </w:t>
+      </w:r>
+      <w:r>
+        <w:rPr>
+          <w:i/>
+        </w:rPr>
+        <w:t>J. Clim.</w:t>
+      </w:r>
+      <w:r>
+        <w:t xml:space="preserve"> </w:t>
+      </w:r>
+      <w:r>
+        <w:rPr>
+          <w:b/>
+        </w:rPr>
+        <w:t>34</w:t>
+      </w:r>
+      <w:r>
+        <w:t>, 6355–6377 (2021). https://doi.org/10.1175/JCLI-D-21-0055.1</w:t>
+      </w:r>
+    </w:p>
+    <w:p>
+      <w:pPr>
+        <w:pStyle w:val="BodyText"/>
+      </w:pPr>
+      <w:r>
+        <w:t xml:space="preserve">13. Ferguglia, O., von Hardenberg, J. &amp; Palazzi, E. Robustness of precipitation emergent constraints in CMIP6 models. </w:t>
+      </w:r>
+      <w:r>
+        <w:rPr>
+          <w:i/>
+        </w:rPr>
+        <w:t>Clim. Dyn.</w:t>
+      </w:r>
+      <w:r>
+        <w:t xml:space="preserve"> </w:t>
+      </w:r>
+      <w:r>
+        <w:rPr>
+          <w:b/>
+        </w:rPr>
+        <w:t>61</w:t>
+      </w:r>
+      <w:r>
+        <w:t>, 1439–1450 (2023). https://doi.org/10.1007/s00382-022-06634-1</w:t>
+      </w:r>
+    </w:p>
+    <w:p>
+      <w:pPr>
+        <w:pStyle w:val="BodyText"/>
+      </w:pPr>
+      <w:r>
+        <w:t xml:space="preserve">14. Sanderson, B. M. et al. The potential for structural errors in emergent constraints. </w:t>
+      </w:r>
+      <w:r>
+        <w:rPr>
+          <w:i/>
+        </w:rPr>
+        <w:t>Earth Syst. Dyn.</w:t>
+      </w:r>
+      <w:r>
+        <w:t xml:space="preserve"> </w:t>
+      </w:r>
+      <w:r>
+        <w:rPr>
+          <w:b/>
+        </w:rPr>
+        <w:t>12</w:t>
+      </w:r>
+      <w:r>
+        <w:t>, 899–918 (2021). https://doi.org/10.5194/esd-12-899-2021</w:t>
+      </w:r>
+    </w:p>
+    <w:p>
+      <w:pPr>
+        <w:pStyle w:val="BodyText"/>
+      </w:pPr>
+      <w:r>
+        <w:t xml:space="preserve">15. Nowack, P. &amp; Watson-Parris, D. Opinion: Why all emergent constraints are wrong but some are useful – a machine learning perspective. </w:t>
+      </w:r>
+      <w:r>
+        <w:rPr>
+          <w:i/>
+        </w:rPr>
+        <w:t>Atmos. Chem. Phys.</w:t>
+      </w:r>
+      <w:r>
+        <w:t xml:space="preserve"> </w:t>
+      </w:r>
+      <w:r>
+        <w:rPr>
+          <w:b/>
+        </w:rPr>
+        <w:t>25</w:t>
+      </w:r>
+      <w:r>
+        <w:t>, 2365–2384 (2025). https://doi.org/10.5194/acp-25-2365-2025</w:t>
+      </w:r>
+    </w:p>
+    <w:p>
+      <w:pPr>
+        <w:pStyle w:val="BodyText"/>
+      </w:pPr>
+      <w:r>
+        <w:t xml:space="preserve">16. Li, T., Zhang, X. &amp; Jiang, Z. What aspect of model performance is the most relevant to skillful future projection on a regional scale? </w:t>
+      </w:r>
+      <w:r>
+        <w:rPr>
+          <w:i/>
+        </w:rPr>
+        <w:t>J. Clim.</w:t>
+      </w:r>
+      <w:r>
+        <w:t xml:space="preserve"> </w:t>
+      </w:r>
+      <w:r>
+        <w:rPr>
+          <w:b/>
+        </w:rPr>
         <w:t>37</w:t>
       </w:r>
       <w:r>
-        <w:t>, 1–15 (2020). https://doi.org/10.1007/s00376-019-9140-8</w:t>
-      </w:r>
-    </w:p>
-    <w:p>
-      <w:pPr>
-        <w:pStyle w:val="BodyText"/>
-      </w:pPr>
-      <w:r>
-        <w:t xml:space="preserve">6. Zhang, W., Furtado, K., Zhou, T., Wu, P. &amp; Chen, X. Constraining extreme precipitation projections using past precipitation variability. </w:t>
+        <w:t>, 1553–1568 (2024). https://doi.org/10.1175/JCLI-D-23-0312.1</w:t>
+      </w:r>
+    </w:p>
+    <w:p>
+      <w:pPr>
+        <w:pStyle w:val="BodyText"/>
+      </w:pPr>
+      <w:r>
+        <w:t xml:space="preserve">17. Maraun, D. et al. Towards process-informed bias correction of climate change simulations. </w:t>
       </w:r>
       <w:r>
         <w:rPr>
           <w:i/>
         </w:rPr>
-        <w:t>Nat. Commun.</w:t>
+        <w:t>Nat. Clim. Change</w:t>
       </w:r>
       <w:r>
         <w:t xml:space="preserve"> </w:t>
@@ -3965,27 +3962,397 @@
         <w:rPr>
           <w:b/>
         </w:rPr>
+        <w:t>7</w:t>
+      </w:r>
+      <w:r>
+        <w:t>, 764–773 (2017). https://doi.org/10.1038/nclimate3418</w:t>
+      </w:r>
+    </w:p>
+    <w:p>
+      <w:pPr>
+        <w:pStyle w:val="BodyText"/>
+      </w:pPr>
+      <w:r>
+        <w:t xml:space="preserve">18. Lafferty, D. C. &amp; Sriver, R. L. Downscaling and bias-correction contribute considerable uncertainty to local climate projections in CMIP6. </w:t>
+      </w:r>
+      <w:r>
+        <w:rPr>
+          <w:i/>
+        </w:rPr>
+        <w:t>npj Clim. Atmos. Sci.</w:t>
+      </w:r>
+      <w:r>
+        <w:t xml:space="preserve"> </w:t>
+      </w:r>
+      <w:r>
+        <w:rPr>
+          <w:b/>
+        </w:rPr>
+        <w:t>6</w:t>
+      </w:r>
+      <w:r>
+        <w:t>, 158 (2023). https://doi.org/10.1038/s41612-023-00486-0</w:t>
+      </w:r>
+    </w:p>
+    <w:p>
+      <w:pPr>
+        <w:pStyle w:val="BodyText"/>
+      </w:pPr>
+      <w:r>
+        <w:t xml:space="preserve">19. Baig, F., Abrar, M., Chen, H. &amp; Sherif, M. Rainfall consistency, variability, and concentration over the UAE: Satellite precipitation products versus rain-gauge observations. </w:t>
+      </w:r>
+      <w:r>
+        <w:rPr>
+          <w:i/>
+        </w:rPr>
+        <w:t>Remote Sens.</w:t>
+      </w:r>
+      <w:r>
+        <w:t xml:space="preserve"> </w:t>
+      </w:r>
+      <w:r>
+        <w:rPr>
+          <w:b/>
+        </w:rPr>
+        <w:t>14</w:t>
+      </w:r>
+      <w:r>
+        <w:t>, 5827 (2022). https://doi.org/10.3390/rs14225827</w:t>
+      </w:r>
+    </w:p>
+    <w:p>
+      <w:pPr>
+        <w:pStyle w:val="BodyText"/>
+      </w:pPr>
+      <w:r>
+        <w:t xml:space="preserve">20. Knutti, R. et al. A climate model projection weighting scheme accounting for performance and interdependence. </w:t>
+      </w:r>
+      <w:r>
+        <w:rPr>
+          <w:i/>
+        </w:rPr>
+        <w:t>Geophys. Res. Lett.</w:t>
+      </w:r>
+      <w:r>
+        <w:t xml:space="preserve"> </w:t>
+      </w:r>
+      <w:r>
+        <w:rPr>
+          <w:b/>
+        </w:rPr>
+        <w:t>44</w:t>
+      </w:r>
+      <w:r>
+        <w:t>, 1909–1918 (2017). https://doi.org/10.1002/2016GL072012</w:t>
+      </w:r>
+    </w:p>
+    <w:p>
+      <w:pPr>
+        <w:pStyle w:val="BodyText"/>
+      </w:pPr>
+      <w:r>
+        <w:t xml:space="preserve">21. Shepherd, T. G. et al. Storylines: an alternative approach to representing uncertainty in the physical aspects of climate change. </w:t>
+      </w:r>
+      <w:r>
+        <w:rPr>
+          <w:i/>
+        </w:rPr>
+        <w:t>Clim. Change</w:t>
+      </w:r>
+      <w:r>
+        <w:t xml:space="preserve"> </w:t>
+      </w:r>
+      <w:r>
+        <w:rPr>
+          <w:b/>
+        </w:rPr>
+        <w:t>151</w:t>
+      </w:r>
+      <w:r>
+        <w:t>, 555–571 (2018). https://doi.org/10.1007/s10584-018-2317-9</w:t>
+      </w:r>
+    </w:p>
+    <w:p>
+      <w:pPr>
+        <w:pStyle w:val="BodyText"/>
+      </w:pPr>
+      <w:r>
+        <w:t xml:space="preserve">22. Smith, A., Lott, N. &amp; Vose, R. The Integrated Surface Database: recent developments and partnerships. </w:t>
+      </w:r>
+      <w:r>
+        <w:rPr>
+          <w:i/>
+        </w:rPr>
+        <w:t>Bull. Am. Meteorol. Soc.</w:t>
+      </w:r>
+      <w:r>
+        <w:t xml:space="preserve"> </w:t>
+      </w:r>
+      <w:r>
+        <w:rPr>
+          <w:b/>
+        </w:rPr>
+        <w:t>92</w:t>
+      </w:r>
+      <w:r>
+        <w:t>, 704–708 (2011). https://doi.org/10.1175/2011BAMS3015.1</w:t>
+      </w:r>
+    </w:p>
+    <w:p>
+      <w:pPr>
+        <w:pStyle w:val="BodyText"/>
+      </w:pPr>
+      <w:r>
+        <w:lastRenderedPageBreak/>
+        <w:t xml:space="preserve">23. Funk, C. et al. The climate hazards infrared precipitation with stations — a new environmental record for monitoring extremes. </w:t>
+      </w:r>
+      <w:r>
+        <w:rPr>
+          <w:i/>
+        </w:rPr>
+        <w:t>Sci. Data</w:t>
+      </w:r>
+      <w:r>
+        <w:t xml:space="preserve"> </w:t>
+      </w:r>
+      <w:r>
+        <w:rPr>
+          <w:b/>
+        </w:rPr>
+        <w:t>2</w:t>
+      </w:r>
+      <w:r>
+        <w:t>, 150066 (2015). https://doi.org/10.1038/sdata.2015.66</w:t>
+      </w:r>
+    </w:p>
+    <w:p>
+      <w:pPr>
+        <w:pStyle w:val="BodyText"/>
+      </w:pPr>
+      <w:r>
+        <w:t xml:space="preserve">24. Hersbach, H. et al. The ERA5 global reanalysis. </w:t>
+      </w:r>
+      <w:r>
+        <w:rPr>
+          <w:i/>
+        </w:rPr>
+        <w:t>Q. J. R. Meteorol. Soc.</w:t>
+      </w:r>
+      <w:r>
+        <w:t xml:space="preserve"> </w:t>
+      </w:r>
+      <w:r>
+        <w:rPr>
+          <w:b/>
+        </w:rPr>
+        <w:t>146</w:t>
+      </w:r>
+      <w:r>
+        <w:t>, 1999–2049 (2020). https://doi.org/10.1002/qj.3803</w:t>
+      </w:r>
+    </w:p>
+    <w:p>
+      <w:pPr>
+        <w:pStyle w:val="BodyText"/>
+      </w:pPr>
+      <w:r>
+        <w:t xml:space="preserve">25. Gelaro, R. et al. The Modern-Era Retrospective Analysis for Research and Applications, Version 2 (MERRA-2). </w:t>
+      </w:r>
+      <w:r>
+        <w:rPr>
+          <w:i/>
+        </w:rPr>
+        <w:t>J. Clim.</w:t>
+      </w:r>
+      <w:r>
+        <w:t xml:space="preserve"> </w:t>
+      </w:r>
+      <w:r>
+        <w:rPr>
+          <w:b/>
+        </w:rPr>
+        <w:t>30</w:t>
+      </w:r>
+      <w:r>
+        <w:t>, 5419–5454 (2017). https://doi.org/10.1175/JCLI-D-16-0758.1</w:t>
+      </w:r>
+    </w:p>
+    <w:p>
+      <w:pPr>
+        <w:pStyle w:val="BodyText"/>
+      </w:pPr>
+      <w:r>
+        <w:t xml:space="preserve">26. Kobayashi, S. et al. The JRA-55 reanalysis: general specifications and basic characteristics. </w:t>
+      </w:r>
+      <w:r>
+        <w:rPr>
+          <w:i/>
+        </w:rPr>
+        <w:t>J. Meteorol. Soc. Jpn.</w:t>
+      </w:r>
+      <w:r>
+        <w:t xml:space="preserve"> </w:t>
+      </w:r>
+      <w:r>
+        <w:rPr>
+          <w:b/>
+        </w:rPr>
+        <w:t>93</w:t>
+      </w:r>
+      <w:r>
+        <w:t>, 5–48 (2015). https://doi.org/10.2151/jmsj.2015-001</w:t>
+      </w:r>
+    </w:p>
+    <w:p>
+      <w:pPr>
+        <w:pStyle w:val="BodyText"/>
+      </w:pPr>
+      <w:r>
+        <w:t xml:space="preserve">27. Eyring, V. et al. Overview of the Coupled Model Intercomparison Project Phase 6 (CMIP6) experimental design and organization. </w:t>
+      </w:r>
+      <w:r>
+        <w:rPr>
+          <w:i/>
+        </w:rPr>
+        <w:t>Geosci. Model Dev.</w:t>
+      </w:r>
+      <w:r>
+        <w:t xml:space="preserve"> </w:t>
+      </w:r>
+      <w:r>
+        <w:rPr>
+          <w:b/>
+        </w:rPr>
+        <w:t>9</w:t>
+      </w:r>
+      <w:r>
+        <w:t>, 1937–1958 (2016). https://doi.org/10.5194/gmd-9-1937-2016</w:t>
+      </w:r>
+    </w:p>
+    <w:p>
+      <w:pPr>
+        <w:pStyle w:val="BodyText"/>
+      </w:pPr>
+      <w:r>
+        <w:t xml:space="preserve">28. Thrasher, B. et al. NASA global daily downscaled projections, CMIP6. </w:t>
+      </w:r>
+      <w:r>
+        <w:rPr>
+          <w:i/>
+        </w:rPr>
+        <w:t>Sci. Data</w:t>
+      </w:r>
+      <w:r>
+        <w:t xml:space="preserve"> </w:t>
+      </w:r>
+      <w:r>
+        <w:rPr>
+          <w:b/>
+        </w:rPr>
+        <w:t>9</w:t>
+      </w:r>
+      <w:r>
+        <w:t>, 262 (2022). https://doi.org/10.1038/s41597-022-01393-4</w:t>
+      </w:r>
+    </w:p>
+    <w:p>
+      <w:pPr>
+        <w:pStyle w:val="BodyText"/>
+      </w:pPr>
+      <w:r>
+        <w:t xml:space="preserve">29. Lange, S. Trend-preserving bias adjustment and statistical downscaling with ISIMIP3BASD (v1.0). </w:t>
+      </w:r>
+      <w:r>
+        <w:rPr>
+          <w:i/>
+        </w:rPr>
+        <w:t>Geosci. Model Dev.</w:t>
+      </w:r>
+      <w:r>
+        <w:t xml:space="preserve"> </w:t>
+      </w:r>
+      <w:r>
+        <w:rPr>
+          <w:b/>
+        </w:rPr>
+        <w:t>12</w:t>
+      </w:r>
+      <w:r>
+        <w:t>, 3055–3070 (2019). https://doi.org/10.5194/gmd-12-3055-2019</w:t>
+      </w:r>
+    </w:p>
+    <w:p>
+      <w:pPr>
+        <w:pStyle w:val="BodyText"/>
+      </w:pPr>
+      <w:r>
+        <w:t xml:space="preserve">30. Zhang, X. et al. Indices for monitoring changes in extremes based on daily temperature and precipitation data. </w:t>
+      </w:r>
+      <w:r>
+        <w:rPr>
+          <w:i/>
+        </w:rPr>
+        <w:t>WIREs Clim. Change</w:t>
+      </w:r>
+      <w:r>
+        <w:t xml:space="preserve"> </w:t>
+      </w:r>
+      <w:r>
+        <w:rPr>
+          <w:b/>
+        </w:rPr>
+        <w:t>2</w:t>
+      </w:r>
+      <w:r>
+        <w:t>, 851–870 (2011). https://doi.org/10.1002/wcc.147</w:t>
+      </w:r>
+    </w:p>
+    <w:p>
+      <w:pPr>
+        <w:pStyle w:val="BodyText"/>
+      </w:pPr>
+      <w:r>
+        <w:t xml:space="preserve">31. Mann, H. B. Nonparametric tests against trend. </w:t>
+      </w:r>
+      <w:r>
+        <w:rPr>
+          <w:i/>
+        </w:rPr>
+        <w:t>Econometrica</w:t>
+      </w:r>
+      <w:r>
+        <w:t xml:space="preserve"> </w:t>
+      </w:r>
+      <w:r>
+        <w:rPr>
+          <w:b/>
+        </w:rPr>
         <w:t>13</w:t>
       </w:r>
       <w:r>
-        <w:t>, 6319 (2022). https://doi.org/10.</w:t>
-      </w:r>
-      <w:r>
-        <w:t>1038/s41467-022-34006-0</w:t>
-      </w:r>
-    </w:p>
-    <w:p>
-      <w:pPr>
-        <w:pStyle w:val="BodyText"/>
-      </w:pPr>
-      <w:r>
-        <w:t xml:space="preserve">7. Thackeray, C. W., Hall, A., Norris, J. &amp; Chen, D. Constraining the increased frequency of global precipitation extremes under warming. </w:t>
+        <w:t>, 245–259 (1945).</w:t>
+      </w:r>
+    </w:p>
+    <w:p>
+      <w:pPr>
+        <w:pStyle w:val="BodyText"/>
+      </w:pPr>
+      <w:r>
+        <w:t>32. Kendall, M. G. Rank Correlation Methods. 4th edn (Charles Griffin, London, 1975).</w:t>
+      </w:r>
+    </w:p>
+    <w:p>
+      <w:pPr>
+        <w:pStyle w:val="BodyText"/>
+      </w:pPr>
+      <w:r>
+        <w:t xml:space="preserve">33. Theil, H. A rank-invariant method of linear and polynomial regression analysis. </w:t>
       </w:r>
       <w:r>
         <w:rPr>
           <w:i/>
         </w:rPr>
-        <w:t>Nat. Clim. Change</w:t>
+        <w:t>Proc. K. Ned. Akad. Wet.</w:t>
       </w:r>
       <w:r>
         <w:t xml:space="preserve"> </w:t>
@@ -3994,27 +4361,24 @@
         <w:rPr>
           <w:b/>
         </w:rPr>
-        <w:t>12</w:t>
-      </w:r>
-      <w:r>
-        <w:t>, 441–448 (2022). https://doi.org/10.1038/s41558-022-01329-1</w:t>
-      </w:r>
-    </w:p>
-    <w:p>
-      <w:pPr>
-        <w:pStyle w:val="BodyText"/>
-      </w:pPr>
-      <w:r>
-        <w:t xml:space="preserve">8. Shiogama, </w:t>
-      </w:r>
-      <w:r>
-        <w:t xml:space="preserve">H. et al. Combined emergent constraints on future extreme precipitation changes. </w:t>
+        <w:t>53</w:t>
+      </w:r>
+      <w:r>
+        <w:t>, 386–392 (1950).</w:t>
+      </w:r>
+    </w:p>
+    <w:p>
+      <w:pPr>
+        <w:pStyle w:val="BodyText"/>
+      </w:pPr>
+      <w:r>
+        <w:t xml:space="preserve">34. Sen, P. K. Estimates of the regression coefficient based on Kendall’s tau. </w:t>
       </w:r>
       <w:r>
         <w:rPr>
           <w:i/>
         </w:rPr>
-        <w:t>Nat. Commun.</w:t>
+        <w:t>J. Am. Stat. Assoc.</w:t>
       </w:r>
       <w:r>
         <w:t xml:space="preserve"> </w:t>
@@ -4023,27 +4387,24 @@
         <w:rPr>
           <w:b/>
         </w:rPr>
-        <w:t>16</w:t>
-      </w:r>
-      <w:r>
-        <w:t>, 5293 (2025). https://doi.org/10.1038/s41467-025-60385-1</w:t>
-      </w:r>
-    </w:p>
-    <w:p>
-      <w:pPr>
-        <w:pStyle w:val="BodyText"/>
-      </w:pPr>
-      <w:r>
-        <w:t>9. Li, C., Liu, J., Du, F., Zwiers, F. W. &amp; Feng, G. Increasing certainty in projected local extreme p</w:t>
-      </w:r>
-      <w:r>
-        <w:t xml:space="preserve">recipitation change. </w:t>
+        <w:t>63</w:t>
+      </w:r>
+      <w:r>
+        <w:t>, 1379–1389 (1968).</w:t>
+      </w:r>
+    </w:p>
+    <w:p>
+      <w:pPr>
+        <w:pStyle w:val="BodyText"/>
+      </w:pPr>
+      <w:r>
+        <w:t xml:space="preserve">35. Hamed, K. H. &amp; Rao, A. R. A modified Mann–Kendall trend test for autocorrelated data. </w:t>
       </w:r>
       <w:r>
         <w:rPr>
           <w:i/>
         </w:rPr>
-        <w:t>Nat. Commun.</w:t>
+        <w:t>J. Hydrol.</w:t>
       </w:r>
       <w:r>
         <w:t xml:space="preserve"> </w:t>
@@ -4052,24 +4413,24 @@
         <w:rPr>
           <w:b/>
         </w:rPr>
-        <w:t>16</w:t>
-      </w:r>
-      <w:r>
-        <w:t>, 850 (2025). https://doi.org/10.1038/s41467-025-56235-9</w:t>
-      </w:r>
-    </w:p>
-    <w:p>
-      <w:pPr>
-        <w:pStyle w:val="BodyText"/>
-      </w:pPr>
-      <w:r>
-        <w:t xml:space="preserve">10. Chemke, R. &amp; Yuval, J. Atmospheric circulation to constrain subtropical precipitation projections. </w:t>
+        <w:t>204</w:t>
+      </w:r>
+      <w:r>
+        <w:t>, 182–196 (1998). https://doi.org/10.1016/S0022-1694(97)00125-X</w:t>
+      </w:r>
+    </w:p>
+    <w:p>
+      <w:pPr>
+        <w:pStyle w:val="BodyText"/>
+      </w:pPr>
+      <w:r>
+        <w:t xml:space="preserve">36. Benjamini, Y. &amp; Hochberg, Y. Controlling the false discovery rate: a practical and powerful approach to multiple testing. </w:t>
       </w:r>
       <w:r>
         <w:rPr>
           <w:i/>
         </w:rPr>
-        <w:t>Nat. Clim. Change</w:t>
+        <w:t>J. R. Stat. Soc. B</w:t>
       </w:r>
       <w:r>
         <w:t xml:space="preserve"> </w:t>
@@ -4078,26 +4439,50 @@
         <w:rPr>
           <w:b/>
         </w:rPr>
-        <w:t>15</w:t>
-      </w:r>
-      <w:r>
-        <w:t>, 287–292 (2025). https://doi.org/10.103</w:t>
-      </w:r>
-      <w:r>
-        <w:t>8/s41558-025-02266-5</w:t>
-      </w:r>
-    </w:p>
-    <w:p>
-      <w:pPr>
-        <w:pStyle w:val="BodyText"/>
-      </w:pPr>
-      <w:r>
-        <w:t xml:space="preserve">11. Schlund, M., Lauer, A., Gentine, P., Sherwood, S. C. &amp; Eyring, V. Emergent constraints on equilibrium climate sensitivity in CMIP5: do they hold for CMIP6? </w:t>
+        <w:t>57</w:t>
+      </w:r>
+      <w:r>
+        <w:t>, 289–300 (1995).</w:t>
+      </w:r>
+    </w:p>
+    <w:p>
+      <w:pPr>
+        <w:pStyle w:val="BodyText"/>
+      </w:pPr>
+      <w:r>
+        <w:t xml:space="preserve">37. Taylor, K. E. Summarizing multiple aspects of model performance in a single diagram. </w:t>
       </w:r>
       <w:r>
         <w:rPr>
           <w:i/>
         </w:rPr>
+        <w:t>J. Geophys. Res.</w:t>
+      </w:r>
+      <w:r>
+        <w:t xml:space="preserve"> </w:t>
+      </w:r>
+      <w:r>
+        <w:rPr>
+          <w:b/>
+        </w:rPr>
+        <w:t>106</w:t>
+      </w:r>
+      <w:r>
+        <w:t>, 7183–7192 (2001). https://doi.org/10.1029/2000JD900719</w:t>
+      </w:r>
+    </w:p>
+    <w:p>
+      <w:pPr>
+        <w:pStyle w:val="BodyText"/>
+      </w:pPr>
+      <w:r>
+        <w:lastRenderedPageBreak/>
+        <w:t xml:space="preserve">38. Brunner, L. et al. Reduced global warming from CMIP6 projections when weighting models by performance and independence. </w:t>
+      </w:r>
+      <w:r>
+        <w:rPr>
+          <w:i/>
+        </w:rPr>
         <w:t>Earth Syst. Dyn.</w:t>
       </w:r>
       <w:r>
@@ -4110,745 +4495,7 @@
         <w:t>11</w:t>
       </w:r>
       <w:r>
-        <w:t>, 1233–1258 (2020). https://doi.org/10.5194/esd-11-1233-</w:t>
-      </w:r>
-      <w:r>
-        <w:t>2020</w:t>
-      </w:r>
-    </w:p>
-    <w:p>
-      <w:pPr>
-        <w:pStyle w:val="BodyText"/>
-      </w:pPr>
-      <w:r>
-        <w:t xml:space="preserve">12. Simpson, I. R. et al. Emergent constraints on the large-scale atmospheric circulation and regional hydroclimate: Do they still work in CMIP6 and how much can they actually constrain the future? </w:t>
-      </w:r>
-      <w:r>
-        <w:rPr>
-          <w:i/>
-        </w:rPr>
-        <w:t>J. Clim.</w:t>
-      </w:r>
-      <w:r>
-        <w:t xml:space="preserve"> </w:t>
-      </w:r>
-      <w:r>
-        <w:rPr>
-          <w:b/>
-        </w:rPr>
-        <w:t>34</w:t>
-      </w:r>
-      <w:r>
-        <w:t>, 6355–6377 (2021). https://doi.org/10.117</w:t>
-      </w:r>
-      <w:r>
-        <w:t>5/JCLI-D-21-0055.1</w:t>
-      </w:r>
-    </w:p>
-    <w:p>
-      <w:pPr>
-        <w:pStyle w:val="BodyText"/>
-      </w:pPr>
-      <w:r>
-        <w:t xml:space="preserve">13. Ferguglia, O., von Hardenberg, J. &amp; Palazzi, E. Robustness of precipitation emergent constraints in CMIP6 models. </w:t>
-      </w:r>
-      <w:r>
-        <w:rPr>
-          <w:i/>
-        </w:rPr>
-        <w:t>Clim. Dyn.</w:t>
-      </w:r>
-      <w:r>
-        <w:t xml:space="preserve"> </w:t>
-      </w:r>
-      <w:r>
-        <w:rPr>
-          <w:b/>
-        </w:rPr>
-        <w:t>61</w:t>
-      </w:r>
-      <w:r>
-        <w:t>, 1439–1450 (2023). https://doi.org/10.1007/s00382-022-06634-1</w:t>
-      </w:r>
-    </w:p>
-    <w:p>
-      <w:pPr>
-        <w:pStyle w:val="BodyText"/>
-      </w:pPr>
-      <w:r>
-        <w:t>14. Sanderson, B. M. et al. The potential f</w:t>
-      </w:r>
-      <w:r>
-        <w:t xml:space="preserve">or structural errors in emergent constraints. </w:t>
-      </w:r>
-      <w:r>
-        <w:rPr>
-          <w:i/>
-        </w:rPr>
-        <w:t>Earth Syst. Dyn.</w:t>
-      </w:r>
-      <w:r>
-        <w:t xml:space="preserve"> </w:t>
-      </w:r>
-      <w:r>
-        <w:rPr>
-          <w:b/>
-        </w:rPr>
-        <w:t>12</w:t>
-      </w:r>
-      <w:r>
-        <w:t>, 899–918 (2021). https://doi.org/10.5194/esd-12-899-2021</w:t>
-      </w:r>
-    </w:p>
-    <w:p>
-      <w:pPr>
-        <w:pStyle w:val="BodyText"/>
-      </w:pPr>
-      <w:r>
-        <w:t>15. Nowack, P. &amp; Watson-Parris, D. Opinion: Why all emergent constraints are wrong but some are useful – a machine learning perspecti</w:t>
-      </w:r>
-      <w:r>
-        <w:t xml:space="preserve">ve. </w:t>
-      </w:r>
-      <w:r>
-        <w:rPr>
-          <w:i/>
-        </w:rPr>
-        <w:t>Atmos. Chem. Phys.</w:t>
-      </w:r>
-      <w:r>
-        <w:t xml:space="preserve"> </w:t>
-      </w:r>
-      <w:r>
-        <w:rPr>
-          <w:b/>
-        </w:rPr>
-        <w:t>25</w:t>
-      </w:r>
-      <w:r>
-        <w:t>, 2365–2384 (2025). https://doi.org/10.5194/acp-25-2365-2025</w:t>
-      </w:r>
-    </w:p>
-    <w:p>
-      <w:pPr>
-        <w:pStyle w:val="BodyText"/>
-      </w:pPr>
-      <w:r>
-        <w:t xml:space="preserve">16. Li, T., Zhang, X. &amp; Jiang, Z. What aspect of model performance is the most relevant to skillful future projection on a regional scale? </w:t>
-      </w:r>
-      <w:r>
-        <w:rPr>
-          <w:i/>
-        </w:rPr>
-        <w:t>J. Clim.</w:t>
-      </w:r>
-      <w:r>
-        <w:t xml:space="preserve"> </w:t>
-      </w:r>
-      <w:r>
-        <w:rPr>
-          <w:b/>
-        </w:rPr>
-        <w:t>37</w:t>
-      </w:r>
-      <w:r>
-        <w:t xml:space="preserve">, 1553–1568 </w:t>
-      </w:r>
-      <w:r>
-        <w:t>(2024). https://doi.org/10.1175/JCLI-D-23-0312.1</w:t>
-      </w:r>
-    </w:p>
-    <w:p>
-      <w:pPr>
-        <w:pStyle w:val="BodyText"/>
-      </w:pPr>
-      <w:r>
-        <w:t xml:space="preserve">17. Maraun, D. et al. Towards process-informed bias correction of climate change simulations. </w:t>
-      </w:r>
-      <w:r>
-        <w:rPr>
-          <w:i/>
-        </w:rPr>
-        <w:t>Nat. Clim. Change</w:t>
-      </w:r>
-      <w:r>
-        <w:t xml:space="preserve"> </w:t>
-      </w:r>
-      <w:r>
-        <w:rPr>
-          <w:b/>
-        </w:rPr>
-        <w:t>7</w:t>
-      </w:r>
-      <w:r>
-        <w:t>, 764–773 (2017). https://doi.org/10.1038/nclimate3418</w:t>
-      </w:r>
-    </w:p>
-    <w:p>
-      <w:pPr>
-        <w:pStyle w:val="BodyText"/>
-      </w:pPr>
-      <w:r>
-        <w:t>18. Lafferty, D. C. &amp; Sriver, R. L. Dow</w:t>
-      </w:r>
-      <w:r>
-        <w:t xml:space="preserve">nscaling and bias-correction contribute considerable uncertainty to local climate projections in CMIP6. </w:t>
-      </w:r>
-      <w:r>
-        <w:rPr>
-          <w:i/>
-        </w:rPr>
-        <w:t>npj Clim. Atmos. Sci.</w:t>
-      </w:r>
-      <w:r>
-        <w:t xml:space="preserve"> </w:t>
-      </w:r>
-      <w:r>
-        <w:rPr>
-          <w:b/>
-        </w:rPr>
-        <w:t>6</w:t>
-      </w:r>
-      <w:r>
-        <w:t>, 158 (2023). https://doi.org/10.1038/s41612-023-00486-0</w:t>
-      </w:r>
-    </w:p>
-    <w:p>
-      <w:pPr>
-        <w:pStyle w:val="BodyText"/>
-      </w:pPr>
-      <w:r>
-        <w:t>19. Baig, F., Abrar, M., Chen, H. &amp; Sherif, M. Rainfall consistency, var</w:t>
-      </w:r>
-      <w:r>
-        <w:t xml:space="preserve">iability, and concentration over the UAE: Satellite precipitation products versus rain-gauge observations. </w:t>
-      </w:r>
-      <w:r>
-        <w:rPr>
-          <w:i/>
-        </w:rPr>
-        <w:t>Remote Sens.</w:t>
-      </w:r>
-      <w:r>
-        <w:t xml:space="preserve"> </w:t>
-      </w:r>
-      <w:r>
-        <w:rPr>
-          <w:b/>
-        </w:rPr>
-        <w:t>14</w:t>
-      </w:r>
-      <w:r>
-        <w:t>, 5827 (2022). https://doi.org/10.3390/rs14225827</w:t>
-      </w:r>
-    </w:p>
-    <w:p>
-      <w:pPr>
-        <w:pStyle w:val="BodyText"/>
-      </w:pPr>
-      <w:r>
-        <w:t>20. Knutti, R. et al. A climate model projection weighting scheme accounting for per</w:t>
-      </w:r>
-      <w:r>
-        <w:t xml:space="preserve">formance and interdependence. </w:t>
-      </w:r>
-      <w:r>
-        <w:rPr>
-          <w:i/>
-        </w:rPr>
-        <w:t>Geophys. Res. Lett.</w:t>
-      </w:r>
-      <w:r>
-        <w:t xml:space="preserve"> </w:t>
-      </w:r>
-      <w:r>
-        <w:rPr>
-          <w:b/>
-        </w:rPr>
-        <w:t>44</w:t>
-      </w:r>
-      <w:r>
-        <w:t>, 1909–1918 (2017). https://doi.org/10.1002/2016GL072012</w:t>
-      </w:r>
-    </w:p>
-    <w:p>
-      <w:pPr>
-        <w:pStyle w:val="BodyText"/>
-      </w:pPr>
-      <w:r>
-        <w:t xml:space="preserve">21. Shepherd, T. G. et al. Storylines: an alternative approach to representing uncertainty in the physical aspects of climate change. </w:t>
-      </w:r>
-      <w:r>
-        <w:rPr>
-          <w:i/>
-        </w:rPr>
-        <w:t>Clim. Change</w:t>
-      </w:r>
-      <w:r>
-        <w:t xml:space="preserve"> </w:t>
-      </w:r>
-      <w:r>
-        <w:rPr>
-          <w:b/>
-        </w:rPr>
-        <w:t>151</w:t>
-      </w:r>
-      <w:r>
-        <w:t>, 555–571 (2018). https://doi.org/10.1007/s10584-018-2317-9</w:t>
-      </w:r>
-    </w:p>
-    <w:p>
-      <w:pPr>
-        <w:pStyle w:val="BodyText"/>
-      </w:pPr>
-      <w:r>
-        <w:t xml:space="preserve">22. Smith, A., Lott, N. &amp; Vose, R. The Integrated Surface Database: recent developments and partnerships. </w:t>
-      </w:r>
-      <w:r>
-        <w:rPr>
-          <w:i/>
-        </w:rPr>
-        <w:t>Bull. Am. Meteorol. Soc.</w:t>
-      </w:r>
-      <w:r>
-        <w:t xml:space="preserve"> </w:t>
-      </w:r>
-      <w:r>
-        <w:rPr>
-          <w:b/>
-        </w:rPr>
-        <w:t>92</w:t>
-      </w:r>
-      <w:r>
-        <w:t>, 704–708 (2011). https://doi.org/10.1175/2011BAMS3015.1</w:t>
-      </w:r>
-    </w:p>
-    <w:p>
-      <w:pPr>
-        <w:pStyle w:val="BodyText"/>
-      </w:pPr>
-      <w:r>
-        <w:t>23.</w:t>
-      </w:r>
-      <w:r>
-        <w:t xml:space="preserve"> Funk, C. et al. The climate hazards infrared precipitation with stations — a new environmental record for monitoring extremes. </w:t>
-      </w:r>
-      <w:r>
-        <w:rPr>
-          <w:i/>
-        </w:rPr>
-        <w:t>Sci. Data</w:t>
-      </w:r>
-      <w:r>
-        <w:t xml:space="preserve"> </w:t>
-      </w:r>
-      <w:r>
-        <w:rPr>
-          <w:b/>
-        </w:rPr>
-        <w:t>2</w:t>
-      </w:r>
-      <w:r>
-        <w:t>, 150066 (2015). https://doi.org/10.1038/sdata.2015.66</w:t>
-      </w:r>
-    </w:p>
-    <w:p>
-      <w:pPr>
-        <w:pStyle w:val="BodyText"/>
-      </w:pPr>
-      <w:r>
-        <w:t xml:space="preserve">24. Hersbach, H. et al. The ERA5 global reanalysis. </w:t>
-      </w:r>
-      <w:r>
-        <w:rPr>
-          <w:i/>
-        </w:rPr>
-        <w:t>Q. J. R. M</w:t>
-      </w:r>
-      <w:r>
-        <w:rPr>
-          <w:i/>
-        </w:rPr>
-        <w:t>eteorol. Soc.</w:t>
-      </w:r>
-      <w:r>
-        <w:t xml:space="preserve"> </w:t>
-      </w:r>
-      <w:r>
-        <w:rPr>
-          <w:b/>
-        </w:rPr>
-        <w:t>146</w:t>
-      </w:r>
-      <w:r>
-        <w:t>, 1999–2049 (2020). https://doi.org/10.1002/qj.3803</w:t>
-      </w:r>
-    </w:p>
-    <w:p>
-      <w:pPr>
-        <w:pStyle w:val="BodyText"/>
-      </w:pPr>
-      <w:r>
-        <w:t xml:space="preserve">25. Gelaro, R. et al. The Modern-Era Retrospective Analysis for Research and Applications, Version 2 (MERRA-2). </w:t>
-      </w:r>
-      <w:r>
-        <w:rPr>
-          <w:i/>
-        </w:rPr>
-        <w:t>J. Clim.</w:t>
-      </w:r>
-      <w:r>
-        <w:t xml:space="preserve"> </w:t>
-      </w:r>
-      <w:r>
-        <w:rPr>
-          <w:b/>
-        </w:rPr>
-        <w:t>30</w:t>
-      </w:r>
-      <w:r>
-        <w:t>, 5419–5454 (2017). https://doi.org/10.1175/JCLI-D-16-0758.1</w:t>
-      </w:r>
-    </w:p>
-    <w:p>
-      <w:pPr>
-        <w:pStyle w:val="BodyText"/>
-      </w:pPr>
-      <w:r>
-        <w:t>26.</w:t>
-      </w:r>
-      <w:r>
-        <w:t xml:space="preserve"> Kobayashi, S. et al. The JRA-55 reanalysis: general specifications and basic characteristics. </w:t>
-      </w:r>
-      <w:r>
-        <w:rPr>
-          <w:i/>
-        </w:rPr>
-        <w:t>J. Meteorol. Soc. Jpn.</w:t>
-      </w:r>
-      <w:r>
-        <w:t xml:space="preserve"> </w:t>
-      </w:r>
-      <w:r>
-        <w:rPr>
-          <w:b/>
-        </w:rPr>
-        <w:t>93</w:t>
-      </w:r>
-      <w:r>
-        <w:t>, 5–48 (2015). https://doi.org/10.2151/jmsj.2015-001</w:t>
-      </w:r>
-    </w:p>
-    <w:p>
-      <w:pPr>
-        <w:pStyle w:val="BodyText"/>
-      </w:pPr>
-      <w:r>
-        <w:t>27. Eyring, V. et al. Overview of the Coupled Model Intercomparison Project Phase 6</w:t>
-      </w:r>
-      <w:r>
-        <w:t xml:space="preserve"> (CMIP6) experimental design and organization. </w:t>
-      </w:r>
-      <w:r>
-        <w:rPr>
-          <w:i/>
-        </w:rPr>
-        <w:t>Geosci. Model Dev.</w:t>
-      </w:r>
-      <w:r>
-        <w:t xml:space="preserve"> </w:t>
-      </w:r>
-      <w:r>
-        <w:rPr>
-          <w:b/>
-        </w:rPr>
-        <w:t>9</w:t>
-      </w:r>
-      <w:r>
-        <w:t>, 1937–1958 (2016). https://doi.org/10.5194/gmd-9-1937-2016</w:t>
-      </w:r>
-    </w:p>
-    <w:p>
-      <w:pPr>
-        <w:pStyle w:val="BodyText"/>
-      </w:pPr>
-      <w:r>
-        <w:t xml:space="preserve">28. Thrasher, B. et al. NASA global daily downscaled projections, CMIP6. </w:t>
-      </w:r>
-      <w:r>
-        <w:rPr>
-          <w:i/>
-        </w:rPr>
-        <w:t>Sci. Data</w:t>
-      </w:r>
-      <w:r>
-        <w:t xml:space="preserve"> </w:t>
-      </w:r>
-      <w:r>
-        <w:rPr>
-          <w:b/>
-        </w:rPr>
-        <w:t>9</w:t>
-      </w:r>
-      <w:r>
-        <w:t>, 262 (2022). https://doi.org/10.1038/s41597-</w:t>
-      </w:r>
-      <w:r>
-        <w:t>022-01393-4</w:t>
-      </w:r>
-    </w:p>
-    <w:p>
-      <w:pPr>
-        <w:pStyle w:val="BodyText"/>
-      </w:pPr>
-      <w:r>
-        <w:t xml:space="preserve">29. Lange, S. Trend-preserving bias adjustment and statistical downscaling with ISIMIP3BASD (v1.0). </w:t>
-      </w:r>
-      <w:r>
-        <w:rPr>
-          <w:i/>
-        </w:rPr>
-        <w:t>Geosci. Model Dev.</w:t>
-      </w:r>
-      <w:r>
-        <w:t xml:space="preserve"> </w:t>
-      </w:r>
-      <w:r>
-        <w:rPr>
-          <w:b/>
-        </w:rPr>
-        <w:t>12</w:t>
-      </w:r>
-      <w:r>
-        <w:t>, 3055–3070 (2019). https://doi.org/10.5194/gmd-12-3055-2019</w:t>
-      </w:r>
-    </w:p>
-    <w:p>
-      <w:pPr>
-        <w:pStyle w:val="BodyText"/>
-      </w:pPr>
-      <w:r>
-        <w:t xml:space="preserve">30. Zhang, X. et al. Indices for monitoring changes in extremes based on daily temperature and precipitation data. </w:t>
-      </w:r>
-      <w:r>
-        <w:rPr>
-          <w:i/>
-        </w:rPr>
-        <w:t>WIREs Clim. Change</w:t>
-      </w:r>
-      <w:r>
-        <w:t xml:space="preserve"> </w:t>
-      </w:r>
-      <w:r>
-        <w:rPr>
-          <w:b/>
-        </w:rPr>
-        <w:t>2</w:t>
-      </w:r>
-      <w:r>
-        <w:t>, 851–870 (2011). https://doi.org/10.1002/wcc.147</w:t>
-      </w:r>
-    </w:p>
-    <w:p>
-      <w:pPr>
-        <w:pStyle w:val="BodyText"/>
-      </w:pPr>
-      <w:r>
-        <w:t xml:space="preserve">31. Mann, H. B. Nonparametric tests against trend. </w:t>
-      </w:r>
-      <w:r>
-        <w:rPr>
-          <w:i/>
-        </w:rPr>
-        <w:t>Econometrica</w:t>
-      </w:r>
-      <w:r>
-        <w:t xml:space="preserve"> </w:t>
-      </w:r>
-      <w:r>
-        <w:rPr>
-          <w:b/>
-        </w:rPr>
-        <w:t>13</w:t>
-      </w:r>
-      <w:r>
-        <w:t>, 245</w:t>
-      </w:r>
-      <w:r>
-        <w:t>–259 (1945).</w:t>
-      </w:r>
-    </w:p>
-    <w:p>
-      <w:pPr>
-        <w:pStyle w:val="BodyText"/>
-      </w:pPr>
-      <w:r>
-        <w:t>32. Kendall, M. G. Rank Correlation Methods. 4th edn (Charles Griffin, London, 1975).</w:t>
-      </w:r>
-    </w:p>
-    <w:p>
-      <w:pPr>
-        <w:pStyle w:val="BodyText"/>
-      </w:pPr>
-      <w:r>
-        <w:t xml:space="preserve">33. Theil, H. A rank-invariant method of linear and polynomial regression analysis. </w:t>
-      </w:r>
-      <w:r>
-        <w:rPr>
-          <w:i/>
-        </w:rPr>
-        <w:t>Proc. K. Ned. Akad. Wet.</w:t>
-      </w:r>
-      <w:r>
-        <w:t xml:space="preserve"> </w:t>
-      </w:r>
-      <w:r>
-        <w:rPr>
-          <w:b/>
-        </w:rPr>
-        <w:t>53</w:t>
-      </w:r>
-      <w:r>
-        <w:t>, 386–392 (1950).</w:t>
-      </w:r>
-    </w:p>
-    <w:p>
-      <w:pPr>
-        <w:pStyle w:val="BodyText"/>
-      </w:pPr>
-      <w:r>
-        <w:t xml:space="preserve">34. Sen, P. K. Estimates of the regression coefficient based on Kendall’s tau. </w:t>
-      </w:r>
-      <w:r>
-        <w:rPr>
-          <w:i/>
-        </w:rPr>
-        <w:t>J. Am. Stat. Assoc.</w:t>
-      </w:r>
-      <w:r>
-        <w:t xml:space="preserve"> </w:t>
-      </w:r>
-      <w:r>
-        <w:rPr>
-          <w:b/>
-        </w:rPr>
-        <w:t>63</w:t>
-      </w:r>
-      <w:r>
-        <w:t>, 1379–1389 (1968).</w:t>
-      </w:r>
-    </w:p>
-    <w:p>
-      <w:pPr>
-        <w:pStyle w:val="BodyText"/>
-      </w:pPr>
-      <w:r>
-        <w:t xml:space="preserve">35. Hamed, K. H. &amp; Rao, A. R. A modified Mann–Kendall trend test for autocorrelated data. </w:t>
-      </w:r>
-      <w:r>
-        <w:rPr>
-          <w:i/>
-        </w:rPr>
-        <w:t>J. Hydrol.</w:t>
-      </w:r>
-      <w:r>
-        <w:t xml:space="preserve"> </w:t>
-      </w:r>
-      <w:r>
-        <w:rPr>
-          <w:b/>
-        </w:rPr>
-        <w:t>204</w:t>
-      </w:r>
-      <w:r>
-        <w:t>, 182–196 (1998). https://doi.o</w:t>
-      </w:r>
-      <w:r>
-        <w:t>rg/10.1016/S0022-1694(97)00125-X</w:t>
-      </w:r>
-    </w:p>
-    <w:p>
-      <w:pPr>
-        <w:pStyle w:val="BodyText"/>
-      </w:pPr>
-      <w:r>
-        <w:t xml:space="preserve">36. Benjamini, Y. &amp; Hochberg, Y. Controlling the false discovery rate: a practical and powerful approach to multiple testing. </w:t>
-      </w:r>
-      <w:r>
-        <w:rPr>
-          <w:i/>
-        </w:rPr>
-        <w:t>J. R. Stat. Soc. B</w:t>
-      </w:r>
-      <w:r>
-        <w:t xml:space="preserve"> </w:t>
-      </w:r>
-      <w:r>
-        <w:rPr>
-          <w:b/>
-        </w:rPr>
-        <w:t>57</w:t>
-      </w:r>
-      <w:r>
-        <w:t>, 289–300 (1995).</w:t>
-      </w:r>
-    </w:p>
-    <w:p>
-      <w:pPr>
-        <w:pStyle w:val="BodyText"/>
-      </w:pPr>
-      <w:r>
-        <w:t>37. Taylor, K. E. Summarizing multiple aspects of model pe</w:t>
-      </w:r>
-      <w:r>
-        <w:t xml:space="preserve">rformance in a single diagram. </w:t>
-      </w:r>
-      <w:r>
-        <w:rPr>
-          <w:i/>
-        </w:rPr>
-        <w:t>J. Geophys. Res.</w:t>
-      </w:r>
-      <w:r>
-        <w:t xml:space="preserve"> </w:t>
-      </w:r>
-      <w:r>
-        <w:rPr>
-          <w:b/>
-        </w:rPr>
-        <w:t>106</w:t>
-      </w:r>
-      <w:r>
-        <w:t>, 7183–7192 (2001). https://doi.org/10.1029/2000JD900719</w:t>
-      </w:r>
-    </w:p>
-    <w:p>
-      <w:pPr>
-        <w:pStyle w:val="BodyText"/>
-      </w:pPr>
-      <w:r>
-        <w:t xml:space="preserve">38. Brunner, L. et al. Reduced global warming from CMIP6 projections when weighting models by performance and independence. </w:t>
-      </w:r>
-      <w:r>
-        <w:rPr>
-          <w:i/>
-        </w:rPr>
-        <w:t>Earth Syst. Dyn.</w:t>
-      </w:r>
-      <w:r>
-        <w:t xml:space="preserve"> </w:t>
-      </w:r>
-      <w:r>
-        <w:rPr>
-          <w:b/>
-        </w:rPr>
-        <w:t>11</w:t>
-      </w:r>
-      <w:r>
-        <w:t>, 995</w:t>
-      </w:r>
-      <w:r>
-        <w:t>–1012 (2020). https://doi.org/10.5194/esd-11-995-2020</w:t>
+        <w:t>, 995–1012 (2020). https://doi.org/10.5194/esd-11-995-2020</w:t>
       </w:r>
     </w:p>
     <w:p>
@@ -4864,10 +4511,7 @@
         <w:pStyle w:val="BodyText"/>
       </w:pPr>
       <w:r>
-        <w:t>This research was supported by the Dubai Future Foundation through its Research, Development and Innovation (RDI) Grant Program, awarded to Canadian University Dubai under Project Refer</w:t>
-      </w:r>
-      <w:r>
-        <w:t>ence No. 2025/DRDI0746 (Principal Investigator: A.F.). The authors thank the UAE National Center of Meteorology for providing station data.</w:t>
+        <w:t>This research was supported by the Dubai Future Foundation through its Research, Development and Innovation (RDI) Grant Program, awarded to Canadian University Dubai under Project Reference No. 2025/DRDI0746 (Principal Investigator: A.F.). The authors thank the UAE National Center of Meteorology for providing station data.</w:t>
       </w:r>
     </w:p>
     <w:p>
@@ -4883,13 +4527,7 @@
         <w:pStyle w:val="BodyText"/>
       </w:pPr>
       <w:r>
-        <w:t>M.U. and A.F. conceived the study. M.U. developed the methodology and analysis software, curate</w:t>
-      </w:r>
-      <w:r>
-        <w:t>d the observational, reanalysis and model archives, carried out the formal analysis, produced the figures and tables, and wrote the original draft. A.F. supervised the work. D.S. contributed to the methodology and validated the statistical procedures. R.G.</w:t>
-      </w:r>
-      <w:r>
-        <w:t xml:space="preserve"> validated the observational data handling and contributed to the writing. A.F., X.W. and R.G. reviewed and edited the manuscript. All authors reviewed and approved the submitted version.</w:t>
+        <w:t>M.U. and A.F. conceived the study. M.U. developed the methodology and analysis software, curated the observational, reanalysis and model archives, carried out the formal analysis, produced the figures and tables, and wrote the original draft. A.F. supervised the work. D.S. contributed to the methodology and validated the statistical procedures. R.G. validated the observational data handling and contributed to the writing. A.F., X.W. and R.G. reviewed and edited the manuscript. All authors reviewed and approved the submitted version.</w:t>
       </w:r>
     </w:p>
     <w:p>
@@ -4913,10 +4551,7 @@
         <w:pStyle w:val="Heading1"/>
       </w:pPr>
       <w:r>
-        <w:t>Addi</w:t>
-      </w:r>
-      <w:r>
-        <w:t>tional information</w:t>
+        <w:t>Additional information</w:t>
       </w:r>
     </w:p>
     <w:p>
@@ -4967,16 +4602,8 @@
         <w:pStyle w:val="Caption"/>
       </w:pPr>
       <w:r>
-        <w:t>Figure 4. Pre-specified constraint battery: correlation between each observabl</w:t>
-      </w:r>
-      <w:r>
-        <w:t>e predictor and projected absolute change, for (a) national Rx1day, (b) national R95p, (c) eastern Rx1day and (d) eastern R95p, under four emission scenarios on an identical 23-model set. Colour is diverging about zero with a neutral midpoint. Cells with a</w:t>
-      </w:r>
-      <w:r>
-        <w:t xml:space="preserve"> bold outline and asterisk satisfy all pre-specified criteria; every such cell uses a predictor that also enters the predictand. Predictor families: A atmospheric process fidelity, B present-day extreme-rainfall state, C present-day variability and histori</w:t>
-      </w:r>
-      <w:r>
-        <w:t>cal change.</w:t>
+        <w:lastRenderedPageBreak/>
+        <w:t>Figure 4. Pre-specified constraint battery: correlation between each observable predictor and projected absolute change, for (a) national Rx1day, (b) national R95p, (c) eastern Rx1day and (d) eastern R95p, under four emission scenarios on an identical 23-model set. Colour is diverging about zero with a neutral midpoint. Cells with a bold outline and asterisk satisfy all pre-specified criteria; every such cell uses a predictor that also enters the predictand. Predictor families: A atmospheric process fidelity, B present-day extreme-rainfall state, C present-day variability and historical change.</w:t>
       </w:r>
     </w:p>
     <w:p>
@@ -4984,10 +4611,7 @@
         <w:pStyle w:val="Caption"/>
       </w:pPr>
       <w:r>
-        <w:t>Figure 5. Two diagnostics for apparent constraints. (a) Correlation across models between two disjoint halves of the same model's historical record. Independent halves correlate positively, as Rx1day does; R95p computed with a threshold estimat</w:t>
-      </w:r>
-      <w:r>
-        <w:t>ed over the same seasons correlates negatively, and estimating the threshold out of sample removes most of the effect. (b) Correlation between historical and future index level in each of the four scenarios, evaluated on an identical 23-model set.</w:t>
+        <w:t>Figure 5. Two diagnostics for apparent constraints. (a) Correlation across models between two disjoint halves of the same model's historical record. Independent halves correlate positively, as Rx1day does; R95p computed with a threshold estimated over the same seasons correlates negatively, and estimating the threshold out of sample removes most of the effect. (b) Correlation between historical and future index level in each of the four scenarios, evaluated on an identical 23-model set.</w:t>
       </w:r>
     </w:p>
     <w:p>
@@ -4995,10 +4619,7 @@
         <w:pStyle w:val="Caption"/>
       </w:pPr>
       <w:r>
-        <w:t>Figure 6</w:t>
-      </w:r>
-      <w:r>
-        <w:t>. Effect of bias-corrected downscaling on inter-model spread. (a,b) Present-day Rx1day and R95p in raw CMIP6 output against the NEX-GDDP equivalent for 27 matched models. (c) Coefficient of variation across models in each version.</w:t>
+        <w:t>Figure 6. Effect of bias-corrected downscaling on inter-model spread. (a,b) Present-day Rx1day and R95p in raw CMIP6 output against the NEX-GDDP equivalent for 27 matched models. (c) Coefficient of variation across models in each version.</w:t>
       </w:r>
     </w:p>
     <w:p>
@@ -5014,13 +4635,7 @@
         <w:pStyle w:val="Caption"/>
       </w:pPr>
       <w:r>
-        <w:t>Table 1. Projected</w:t>
-      </w:r>
-      <w:r>
-        <w:t xml:space="preserve"> change in wet-season extreme rainfall for 2076–2100 relative to 1990–2014, for the 23 NEX-GDDP-CMIP6 models available under all four scenarios. Cells give the multi-model mean percentage change, the inter-model standard deviation in percentage points, and</w:t>
-      </w:r>
-      <w:r>
-        <w:t xml:space="preserve"> the number of models projecting an increase. Baselines are wet-season means over 1990–2014 computed over valid land cells.</w:t>
+        <w:t>Table 1. Projected change in wet-season extreme rainfall for 2076–2100 relative to 1990–2014, for the 23 NEX-GDDP-CMIP6 models available under all four scenarios. Cells give the multi-model mean percentage change, the inter-model standard deviation in percentage points, and the number of models projecting an increase. Baselines are wet-season means over 1990–2014 computed over valid land cells.</w:t>
       </w:r>
     </w:p>
     <w:tbl>
@@ -5517,13 +5132,7 @@
         <w:pStyle w:val="Caption"/>
       </w:pPr>
       <w:r>
-        <w:t>Table 2. Outcome of the pre-specified constraint battery. Eleven predictors were tested against projected change in two indices over two domains under four scenarios, gi</w:t>
-      </w:r>
-      <w:r>
-        <w:t>ving 176 tests for each predictand form, with Benjamini-Hochberg control applied once across the whole grid. A test satisfies the criteria if its adjusted probability is below 0.05, its leave-one-family-out skill is positive, and its bootstrap sign stabili</w:t>
-      </w:r>
-      <w:r>
-        <w:t>ty exceeds 0.9.</w:t>
+        <w:t>Table 2. Outcome of the pre-specified constraint battery. Eleven predictors were tested against projected change in two indices over two domains under four scenarios, giving 176 tests for each predictand form, with Benjamini-Hochberg control applied once across the whole grid. A test satisfies the criteria if its adjusted probability is below 0.05, its leave-one-family-out skill is positive, and its bootstrap sign stability exceeds 0.9.</w:t>
       </w:r>
     </w:p>
     <w:tbl>
@@ -5730,13 +5339,7 @@
               <w:rPr>
                 <w:sz w:val="18"/>
               </w:rPr>
-              <w:t xml:space="preserve">Predictor </w:t>
-            </w:r>
-            <w:r>
-              <w:rPr>
-                <w:sz w:val="18"/>
-              </w:rPr>
-              <w:t>independent of the predictand</w:t>
+              <w:t>Predictor independent of the predictand</w:t>
             </w:r>
           </w:p>
         </w:tc>

</xml_diff>